<commit_message>
feat: add support for Mẫu 3b with template layout preserving
</commit_message>
<xml_diff>
--- a/webapp/templates/TOTRINH/03b_Mau_Cong_van_gui_1_don_vi.docx
+++ b/webapp/templates/TOTRINH/03b_Mau_Cong_van_gui_1_don_vi.docx
@@ -1,163 +1,7 @@
 
 <file path=word/document.xml><?xml version="1.0" encoding="utf-8"?>
-<w:document xmlns:wpc="http://schemas.microsoft.com/office/word/2010/wordprocessingCanvas" xmlns:cx="http://schemas.microsoft.com/office/drawing/2014/chartex" xmlns:cx1="http://schemas.microsoft.com/office/drawing/2015/9/8/chartex" xmlns:cx2="http://schemas.microsoft.com/office/drawing/2015/10/21/chartex" xmlns:cx3="http://schemas.microsoft.com/office/drawing/2016/5/9/chartex" xmlns:cx4="http://schemas.microsoft.com/office/drawing/2016/5/10/chartex" xmlns:cx5="http://schemas.microsoft.com/office/drawing/2016/5/11/chartex" xmlns:cx6="http://schemas.microsoft.com/office/drawing/2016/5/12/chartex" xmlns:cx7="http://schemas.microsoft.com/office/drawing/2016/5/13/chartex" xmlns:cx8="http://schemas.microsoft.com/office/drawing/2016/5/14/chartex" xmlns:mc="http://schemas.openxmlformats.org/markup-compatibility/2006" xmlns:aink="http://schemas.microsoft.com/office/drawing/2016/ink" xmlns:am3d="http://schemas.microsoft.com/office/drawing/2017/model3d" xmlns:o="urn:schemas-microsoft-com:office:office" xmlns:oel="http://schemas.microsoft.com/office/2019/extlst" xmlns:r="http://schemas.openxmlformats.org/officeDocument/2006/relationships" xmlns:m="http://schemas.openxmlformats.org/officeDocument/2006/math" xmlns:v="urn:schemas-microsoft-com:vml" xmlns:wp14="http://schemas.microsoft.com/office/word/2010/wordprocessingDrawing" xmlns:wp="http://schemas.openxmlformats.org/drawingml/2006/wordprocessingDrawing" xmlns:w10="urn:schemas-microsoft-com:office:word" xmlns:w="http://schemas.openxmlformats.org/wordprocessingml/2006/main" xmlns:w14="http://schemas.microsoft.com/office/word/2010/wordml" xmlns:w15="http://schemas.microsoft.com/office/word/2012/wordml" xmlns:w16cex="http://schemas.microsoft.com/office/word/2018/wordml/cex" xmlns:w16cid="http://schemas.microsoft.com/office/word/2016/wordml/cid" xmlns:w16="http://schemas.microsoft.com/office/word/2018/wordml" xmlns:w16du="http://schemas.microsoft.com/office/word/2023/wordml/word16du" xmlns:w16sdtdh="http://schemas.microsoft.com/office/word/2020/wordml/sdtdatahash" xmlns:w16sdtfl="http://schemas.microsoft.com/office/word/2024/wordml/sdtformatlock" xmlns:w16se="http://schemas.microsoft.com/office/word/2015/wordml/symex" xmlns:wpg="http://schemas.microsoft.com/office/word/2010/wordprocessingGroup" xmlns:wpi="http://schemas.microsoft.com/office/word/2010/wordprocessingInk" xmlns:wne="http://schemas.microsoft.com/office/word/2006/wordml" xmlns:wps="http://schemas.microsoft.com/office/word/2010/wordprocessingShape" mc:Ignorable="w14 w15 w16se w16cid w16 w16cex w16sdtdh w16sdtfl w16du wp14">
+<w:document xmlns:wpc="http://schemas.microsoft.com/office/word/2010/wordprocessingCanvas" xmlns:cx="http://schemas.microsoft.com/office/drawing/2014/chartex" xmlns:cx1="http://schemas.microsoft.com/office/drawing/2015/9/8/chartex" xmlns:cx2="http://schemas.microsoft.com/office/drawing/2015/10/21/chartex" xmlns:cx3="http://schemas.microsoft.com/office/drawing/2016/5/9/chartex" xmlns:cx4="http://schemas.microsoft.com/office/drawing/2016/5/10/chartex" xmlns:cx5="http://schemas.microsoft.com/office/drawing/2016/5/11/chartex" xmlns:cx6="http://schemas.microsoft.com/office/drawing/2016/5/12/chartex" xmlns:cx7="http://schemas.microsoft.com/office/drawing/2016/5/13/chartex" xmlns:cx8="http://schemas.microsoft.com/office/drawing/2016/5/14/chartex" xmlns:mc="http://schemas.openxmlformats.org/markup-compatibility/2006" xmlns:aink="http://schemas.microsoft.com/office/drawing/2016/ink" xmlns:am3d="http://schemas.microsoft.com/office/drawing/2017/model3d" xmlns:o="urn:schemas-microsoft-com:office:office" xmlns:oel="http://schemas.microsoft.com/office/2019/extlst" xmlns:r="http://schemas.openxmlformats.org/officeDocument/2006/relationships" xmlns:m="http://schemas.openxmlformats.org/officeDocument/2006/math" xmlns:v="urn:schemas-microsoft-com:vml" xmlns:wp14="http://schemas.microsoft.com/office/word/2010/wordprocessingDrawing" xmlns:wp="http://schemas.openxmlformats.org/drawingml/2006/wordprocessingDrawing" xmlns:w10="urn:schemas-microsoft-com:office:word" xmlns:w="http://schemas.openxmlformats.org/wordprocessingml/2006/main" xmlns:w14="http://schemas.microsoft.com/office/word/2010/wordml" xmlns:w15="http://schemas.microsoft.com/office/word/2012/wordml" xmlns:w16cei="http://schemas.microsoft.com/office/word/2026/wordml/cei" xmlns:w16cex="http://schemas.microsoft.com/office/word/2018/wordml/cex" xmlns:w16cid="http://schemas.microsoft.com/office/word/2016/wordml/cid" xmlns:w16="http://schemas.microsoft.com/office/word/2018/wordml" xmlns:w16du="http://schemas.microsoft.com/office/word/2023/wordml/word16du" xmlns:w16sdtdh="http://schemas.microsoft.com/office/word/2020/wordml/sdtdatahash" xmlns:w16sdtfl="http://schemas.microsoft.com/office/word/2024/wordml/sdtformatlock" xmlns:w16se="http://schemas.microsoft.com/office/word/2015/wordml/symex" xmlns:wpg="http://schemas.microsoft.com/office/word/2010/wordprocessingGroup" xmlns:wpi="http://schemas.microsoft.com/office/word/2010/wordprocessingInk" xmlns:wne="http://schemas.microsoft.com/office/word/2006/wordml" xmlns:wps="http://schemas.microsoft.com/office/word/2010/wordprocessingShape" mc:Ignorable="w14 w15 w16se w16cid w16 w16cex w16sdtdh w16sdtfl w16du wp14">
   <w:body>
-    <w:tbl>
-      <w:tblPr>
-        <w:tblW w:w="9435" w:type="dxa"/>
-        <w:tblInd w:w="-113" w:type="dxa"/>
-        <w:tblBorders>
-          <w:bottom w:val="single" w:sz="8" w:space="0" w:color="auto"/>
-        </w:tblBorders>
-        <w:tblLayout w:type="fixed"/>
-        <w:tblLook w:val="0000" w:firstRow="0" w:lastRow="0" w:firstColumn="0" w:lastColumn="0" w:noHBand="0" w:noVBand="0"/>
-      </w:tblPr>
-      <w:tblGrid>
-        <w:gridCol w:w="9435"/>
-      </w:tblGrid>
-      <w:tr>
-        <w:trPr>
-          <w:cantSplit/>
-        </w:trPr>
-        <w:tc>
-          <w:tcPr>
-            <w:tcW w:w="9435" w:type="dxa"/>
-          </w:tcPr>
-          <w:p>
-            <w:pPr>
-              <w:pStyle w:val="BodyTextIndent"/>
-              <w:spacing w:after="0"/>
-              <w:ind w:firstLine="0"/>
-              <w:rPr>
-                <w:rFonts w:ascii="Times New Roman" w:hAnsi="Times New Roman"/>
-                <w:b/>
-                <w:szCs w:val="28"/>
-              </w:rPr>
-            </w:pPr>
-            <w:r>
-              <w:rPr>
-                <w:rFonts w:ascii="Times New Roman" w:hAnsi="Times New Roman"/>
-                <w:b/>
-                <w:szCs w:val="28"/>
-              </w:rPr>
-            </w:r>
-            <w:r>
-              <w:rPr>
-                <w:rFonts w:ascii="Times New Roman" w:hAnsi="Times New Roman"/>
-                <w:b/>
-                <w:szCs w:val="28"/>
-              </w:rPr>
-            </w:r>
-            <w:r>
-              <w:rPr>
-                <w:rFonts w:ascii="Times New Roman" w:hAnsi="Times New Roman"/>
-                <w:b/>
-                <w:szCs w:val="28"/>
-              </w:rPr>
-              <w:t xml:space="preserve">Mẫu </w:t>
-            </w:r>
-            <w:r>
-              <w:rPr>
-                <w:rFonts w:ascii="Times New Roman" w:hAnsi="Times New Roman"/>
-                <w:b/>
-                <w:szCs w:val="28"/>
-              </w:rPr>
-              <w:t>3</w:t>
-            </w:r>
-            <w:r>
-              <w:rPr>
-                <w:rFonts w:ascii="Times New Roman" w:hAnsi="Times New Roman"/>
-                <w:b/>
-                <w:szCs w:val="28"/>
-              </w:rPr>
-              <w:t>b</w:t>
-            </w:r>
-            <w:r>
-              <w:rPr>
-                <w:rFonts w:ascii="Times New Roman" w:hAnsi="Times New Roman"/>
-                <w:b/>
-                <w:szCs w:val="28"/>
-              </w:rPr>
-              <w:t>.</w:t>
-            </w:r>
-            <w:r>
-              <w:rPr>
-                <w:rFonts w:ascii="Times New Roman" w:hAnsi="Times New Roman"/>
-                <w:b/>
-                <w:szCs w:val="28"/>
-              </w:rPr>
-              <w:t xml:space="preserve"> </w:t>
-            </w:r>
-            <w:r>
-              <w:rPr>
-                <w:rFonts w:ascii="Times New Roman" w:hAnsi="Times New Roman"/>
-                <w:b/>
-                <w:szCs w:val="28"/>
-              </w:rPr>
-              <w:t xml:space="preserve">Mẫu </w:t>
-            </w:r>
-            <w:r>
-              <w:rPr>
-                <w:rFonts w:ascii="Times New Roman" w:hAnsi="Times New Roman"/>
-                <w:b/>
-                <w:szCs w:val="28"/>
-              </w:rPr>
-              <w:t>Công v</w:t>
-            </w:r>
-            <w:r>
-              <w:rPr>
-                <w:rFonts w:ascii="Times New Roman" w:hAnsi="Times New Roman" w:hint="eastAsia"/>
-                <w:b/>
-                <w:szCs w:val="28"/>
-              </w:rPr>
-              <w:t>ă</w:t>
-            </w:r>
-            <w:r>
-              <w:rPr>
-                <w:rFonts w:ascii="Times New Roman" w:hAnsi="Times New Roman"/>
-                <w:b/>
-                <w:szCs w:val="28"/>
-              </w:rPr>
-              <w:t>n</w:t>
-            </w:r>
-            <w:r>
-              <w:rPr>
-                <w:rFonts w:ascii="Times New Roman" w:hAnsi="Times New Roman"/>
-                <w:szCs w:val="28"/>
-              </w:rPr>
-              <w:t xml:space="preserve"> </w:t>
-            </w:r>
-            <w:r>
-              <w:rPr>
-                <w:rFonts w:ascii="Times New Roman" w:hAnsi="Times New Roman"/>
-                <w:b/>
-                <w:bCs/>
-                <w:szCs w:val="28"/>
-              </w:rPr>
-              <w:t xml:space="preserve">gửi cho </w:t>
-            </w:r>
-            <w:r>
-              <w:rPr>
-                <w:rFonts w:ascii="Times New Roman" w:hAnsi="Times New Roman"/>
-                <w:b/>
-                <w:bCs/>
-                <w:szCs w:val="28"/>
-              </w:rPr>
-              <w:t>một</w:t>
-            </w:r>
-            <w:r>
-              <w:rPr>
-                <w:rFonts w:ascii="Times New Roman" w:hAnsi="Times New Roman"/>
-                <w:b/>
-                <w:bCs/>
-                <w:szCs w:val="28"/>
-              </w:rPr>
-              <w:t xml:space="preserve"> đơn vị tại nơi kính gửi</w:t>
-            </w:r>
-          </w:p>
-        </w:tc>
-      </w:tr>
-    </w:tbl>
     <w:p>
       <w:pPr>
         <w:pStyle w:val="BodyTextIndent"/>
@@ -165,6 +9,7 @@
         <w:ind w:firstLine="0"/>
         <w:rPr>
           <w:rFonts w:ascii="Times New Roman" w:hAnsi="Times New Roman"/>
+          <w:lang w:val="vi-VN"/>
         </w:rPr>
       </w:pPr>
     </w:p>
@@ -197,33 +42,23 @@
               <w:jc w:val="center"/>
               <w:rPr>
                 <w:rFonts w:ascii="Times New Roman" w:hAnsi="Times New Roman"/>
-                <w:sz w:val="26"/>
-                <w:szCs w:val="26"/>
+                <w:szCs w:val="28"/>
+                <w:lang w:val="vi-VN"/>
               </w:rPr>
             </w:pPr>
             <w:r>
               <w:rPr>
                 <w:rFonts w:ascii="Times New Roman" w:hAnsi="Times New Roman"/>
-                <w:sz w:val="26"/>
-                <w:szCs w:val="26"/>
-              </w:rPr>
-              <w:t xml:space="preserve">TẬP </w:t>
-            </w:r>
-            <w:r>
-              <w:rPr>
-                <w:rFonts w:ascii="Times New Roman" w:hAnsi="Times New Roman" w:hint="eastAsia"/>
-                <w:sz w:val="26"/>
-                <w:szCs w:val="26"/>
-              </w:rPr>
-              <w:t>Đ</w:t>
-            </w:r>
-            <w:r>
-              <w:rPr>
-                <w:rFonts w:ascii="Times New Roman" w:hAnsi="Times New Roman"/>
-                <w:sz w:val="26"/>
-                <w:szCs w:val="26"/>
-              </w:rPr>
-              <w:t xml:space="preserve">OÀN </w:t>
+                <w:szCs w:val="28"/>
+              </w:rPr>
+              <w:t xml:space="preserve">VIỄN THÔNG </w:t>
+            </w:r>
+            <w:r>
+              <w:rPr>
+                <w:rFonts w:ascii="Times New Roman" w:hAnsi="Times New Roman"/>
+                <w:szCs w:val="28"/>
+              </w:rPr>
+              <w:t>TÂY NINH</w:t>
             </w:r>
           </w:p>
           <w:p>
@@ -231,52 +66,6 @@
               <w:jc w:val="center"/>
               <w:rPr>
                 <w:rFonts w:ascii="Times New Roman" w:hAnsi="Times New Roman"/>
-                <w:sz w:val="26"/>
-                <w:szCs w:val="26"/>
-              </w:rPr>
-            </w:pPr>
-            <w:r>
-              <w:rPr>
-                <w:rFonts w:ascii="Times New Roman" w:hAnsi="Times New Roman"/>
-                <w:sz w:val="26"/>
-                <w:szCs w:val="26"/>
-              </w:rPr>
-              <w:t>B</w:t>
-            </w:r>
-            <w:r>
-              <w:rPr>
-                <w:rFonts w:ascii="Times New Roman" w:hAnsi="Times New Roman" w:hint="eastAsia"/>
-                <w:sz w:val="26"/>
-                <w:szCs w:val="26"/>
-              </w:rPr>
-              <w:t>Ư</w:t>
-            </w:r>
-            <w:r>
-              <w:rPr>
-                <w:rFonts w:ascii="Times New Roman" w:hAnsi="Times New Roman"/>
-                <w:sz w:val="26"/>
-                <w:szCs w:val="26"/>
-              </w:rPr>
-              <w:t xml:space="preserve">U CHÍNH VIỄN THÔNG VIỆT </w:t>
-            </w:r>
-            <w:smartTag w:uri="urn:schemas-microsoft-com:office:smarttags" w:element="place">
-              <w:smartTag w:uri="urn:schemas-microsoft-com:office:smarttags" w:element="country-region">
-                <w:r>
-                  <w:rPr>
-                    <w:rFonts w:ascii="Times New Roman" w:hAnsi="Times New Roman"/>
-                    <w:sz w:val="26"/>
-                    <w:szCs w:val="26"/>
-                  </w:rPr>
-                  <w:t>NAM</w:t>
-                </w:r>
-              </w:smartTag>
-            </w:smartTag>
-          </w:p>
-          <w:p>
-            <w:pPr>
-              <w:jc w:val="center"/>
-              <w:rPr>
-                <w:rFonts w:ascii="Times New Roman" w:hAnsi="Times New Roman"/>
                 <w:b/>
                 <w:sz w:val="24"/>
                 <w:szCs w:val="24"/>
@@ -288,17 +77,9 @@
                 <w:b/>
                 <w:bCs/>
                 <w:szCs w:val="28"/>
-              </w:rPr>
-              <w:t xml:space="preserve">VIỄN THÔNG </w:t>
-            </w:r>
-            <w:r>
-              <w:rPr>
-                <w:rFonts w:ascii="Times New Roman" w:hAnsi="Times New Roman"/>
-                <w:b/>
-                <w:bCs/>
-                <w:szCs w:val="28"/>
-              </w:rPr>
-              <w:t>TÂY NINH</w:t>
+                <w:lang w:val="vi-VN"/>
+              </w:rPr>
+              <w:t xml:space="preserve">TRUNG TÂM HẠ TẦNG </w:t>
             </w:r>
             <w:r>
               <w:rPr>
@@ -422,8 +203,8 @@
               </w:rPr>
               <w:t xml:space="preserve">CỘNG HOÀ XÃ HỘI CHỦ NGHĨA VIỆT </w:t>
             </w:r>
-            <w:smartTag w:uri="urn:schemas-microsoft-com:office:smarttags" w:element="place">
-              <w:smartTag w:uri="urn:schemas-microsoft-com:office:smarttags" w:element="country-region">
+            <w:smartTag w:uri="urn:schemas-microsoft-com:office:smarttags" w:element="country-region">
+              <w:smartTag w:uri="urn:schemas-microsoft-com:office:smarttags" w:element="place">
                 <w:r>
                   <w:rPr>
                     <w:rFonts w:ascii="Times New Roman" w:hAnsi="Times New Roman"/>
@@ -444,6 +225,7 @@
                 <w:szCs w:val="28"/>
               </w:rPr>
             </w:pPr>
+            <w:proofErr w:type="spellStart"/>
             <w:r>
               <w:rPr>
                 <w:rFonts w:ascii="Times New Roman" w:hAnsi="Times New Roman" w:hint="eastAsia"/>
@@ -458,8 +240,81 @@
                 <w:b/>
                 <w:szCs w:val="28"/>
               </w:rPr>
-              <w:t>ộc lập - Tự do - Hạnh phúc</w:t>
-            </w:r>
+              <w:t>ộc</w:t>
+            </w:r>
+            <w:proofErr w:type="spellEnd"/>
+            <w:r>
+              <w:rPr>
+                <w:rFonts w:ascii="Times New Roman" w:hAnsi="Times New Roman"/>
+                <w:b/>
+                <w:szCs w:val="28"/>
+              </w:rPr>
+              <w:t xml:space="preserve"> </w:t>
+            </w:r>
+            <w:proofErr w:type="spellStart"/>
+            <w:r>
+              <w:rPr>
+                <w:rFonts w:ascii="Times New Roman" w:hAnsi="Times New Roman"/>
+                <w:b/>
+                <w:szCs w:val="28"/>
+              </w:rPr>
+              <w:t>lập</w:t>
+            </w:r>
+            <w:proofErr w:type="spellEnd"/>
+            <w:r>
+              <w:rPr>
+                <w:rFonts w:ascii="Times New Roman" w:hAnsi="Times New Roman"/>
+                <w:b/>
+                <w:szCs w:val="28"/>
+              </w:rPr>
+              <w:t xml:space="preserve"> - </w:t>
+            </w:r>
+            <w:proofErr w:type="spellStart"/>
+            <w:r>
+              <w:rPr>
+                <w:rFonts w:ascii="Times New Roman" w:hAnsi="Times New Roman"/>
+                <w:b/>
+                <w:szCs w:val="28"/>
+              </w:rPr>
+              <w:t>Tự</w:t>
+            </w:r>
+            <w:proofErr w:type="spellEnd"/>
+            <w:r>
+              <w:rPr>
+                <w:rFonts w:ascii="Times New Roman" w:hAnsi="Times New Roman"/>
+                <w:b/>
+                <w:szCs w:val="28"/>
+              </w:rPr>
+              <w:t xml:space="preserve"> do - </w:t>
+            </w:r>
+            <w:proofErr w:type="spellStart"/>
+            <w:r>
+              <w:rPr>
+                <w:rFonts w:ascii="Times New Roman" w:hAnsi="Times New Roman"/>
+                <w:b/>
+                <w:szCs w:val="28"/>
+              </w:rPr>
+              <w:t>Hạnh</w:t>
+            </w:r>
+            <w:proofErr w:type="spellEnd"/>
+            <w:r>
+              <w:rPr>
+                <w:rFonts w:ascii="Times New Roman" w:hAnsi="Times New Roman"/>
+                <w:b/>
+                <w:szCs w:val="28"/>
+              </w:rPr>
+              <w:t xml:space="preserve"> </w:t>
+            </w:r>
+            <w:proofErr w:type="spellStart"/>
+            <w:r>
+              <w:rPr>
+                <w:rFonts w:ascii="Times New Roman" w:hAnsi="Times New Roman"/>
+                <w:b/>
+                <w:szCs w:val="28"/>
+              </w:rPr>
+              <w:t>phúc</w:t>
+            </w:r>
+            <w:proofErr w:type="spellEnd"/>
           </w:p>
           <w:p>
             <w:pPr>
@@ -575,12 +430,21 @@
               </w:rPr>
               <w:t xml:space="preserve">      </w:t>
             </w:r>
-            <w:r>
-              <w:rPr>
-                <w:rFonts w:ascii="Times New Roman" w:hAnsi="Times New Roman"/>
-                <w:szCs w:val="28"/>
-              </w:rPr>
-              <w:t xml:space="preserve">Số:            </w:t>
+            <w:proofErr w:type="spellStart"/>
+            <w:r>
+              <w:rPr>
+                <w:rFonts w:ascii="Times New Roman" w:hAnsi="Times New Roman"/>
+                <w:szCs w:val="28"/>
+              </w:rPr>
+              <w:t>Số</w:t>
+            </w:r>
+            <w:proofErr w:type="spellEnd"/>
+            <w:r>
+              <w:rPr>
+                <w:rFonts w:ascii="Times New Roman" w:hAnsi="Times New Roman"/>
+                <w:szCs w:val="28"/>
+              </w:rPr>
+              <w:t xml:space="preserve">:            </w:t>
             </w:r>
           </w:p>
         </w:tc>
@@ -614,13 +478,50 @@
               </w:rPr>
               <w:t xml:space="preserve">, </w:t>
             </w:r>
+            <w:proofErr w:type="spellStart"/>
             <w:r>
               <w:rPr>
                 <w:rFonts w:ascii="Times New Roman" w:hAnsi="Times New Roman"/>
                 <w:i/>
                 <w:szCs w:val="28"/>
               </w:rPr>
-              <w:t>ngày        tháng      n</w:t>
+              <w:t>ngày</w:t>
+            </w:r>
+            <w:proofErr w:type="spellEnd"/>
+            <w:r>
+              <w:rPr>
+                <w:rFonts w:ascii="Times New Roman" w:hAnsi="Times New Roman"/>
+                <w:i/>
+                <w:szCs w:val="28"/>
+              </w:rPr>
+              <w:t xml:space="preserve">        </w:t>
+            </w:r>
+            <w:proofErr w:type="spellStart"/>
+            <w:r>
+              <w:rPr>
+                <w:rFonts w:ascii="Times New Roman" w:hAnsi="Times New Roman"/>
+                <w:i/>
+                <w:szCs w:val="28"/>
+              </w:rPr>
+              <w:t>tháng</w:t>
+            </w:r>
+            <w:proofErr w:type="spellEnd"/>
+            <w:r>
+              <w:rPr>
+                <w:rFonts w:ascii="Times New Roman" w:hAnsi="Times New Roman"/>
+                <w:i/>
+                <w:szCs w:val="28"/>
+              </w:rPr>
+              <w:t xml:space="preserve">      </w:t>
+            </w:r>
+            <w:proofErr w:type="spellStart"/>
+            <w:r>
+              <w:rPr>
+                <w:rFonts w:ascii="Times New Roman" w:hAnsi="Times New Roman"/>
+                <w:i/>
+                <w:szCs w:val="28"/>
+              </w:rPr>
+              <w:t>n</w:t>
             </w:r>
             <w:r>
               <w:rPr>
@@ -636,7 +537,16 @@
                 <w:i/>
                 <w:szCs w:val="28"/>
               </w:rPr>
-              <w:t xml:space="preserve">m </w:t>
+              <w:t>m</w:t>
+            </w:r>
+            <w:proofErr w:type="spellEnd"/>
+            <w:r>
+              <w:rPr>
+                <w:rFonts w:ascii="Times New Roman" w:hAnsi="Times New Roman"/>
+                <w:i/>
+                <w:szCs w:val="28"/>
+              </w:rPr>
+              <w:t xml:space="preserve"> </w:t>
             </w:r>
           </w:p>
         </w:tc>
@@ -668,7 +578,15 @@
                 <w:rFonts w:ascii="Arial" w:hAnsi="Arial" w:cs="Arial"/>
                 <w:sz w:val="26"/>
               </w:rPr>
-              <w:t>………</w:t>
+              <w:t>……</w:t>
+            </w:r>
+            <w:proofErr w:type="gramStart"/>
+            <w:r>
+              <w:rPr>
+                <w:rFonts w:ascii="Arial" w:hAnsi="Arial" w:cs="Arial"/>
+                <w:sz w:val="26"/>
+              </w:rPr>
+              <w:t>…</w:t>
             </w:r>
             <w:r>
               <w:rPr>
@@ -707,14 +625,31 @@
                 <w:rFonts w:ascii="Arial" w:hAnsi="Arial" w:cs="Arial"/>
                 <w:sz w:val="26"/>
               </w:rPr>
-              <w:t>…………</w:t>
-            </w:r>
-            <w:r>
-              <w:rPr>
+              <w:t>…</w:t>
+            </w:r>
+            <w:proofErr w:type="gramEnd"/>
+            <w:r>
+              <w:rPr>
+                <w:rFonts w:ascii="Arial" w:hAnsi="Arial" w:cs="Arial"/>
                 <w:sz w:val="26"/>
               </w:rPr>
+              <w:t>……</w:t>
+            </w:r>
+            <w:proofErr w:type="gramStart"/>
+            <w:r>
+              <w:rPr>
+                <w:rFonts w:ascii="Arial" w:hAnsi="Arial" w:cs="Arial"/>
+                <w:sz w:val="26"/>
+              </w:rPr>
+              <w:t>…</w:t>
+            </w:r>
+            <w:r>
+              <w:rPr>
+                <w:sz w:val="26"/>
+              </w:rPr>
               <w:t>..</w:t>
             </w:r>
+            <w:proofErr w:type="gramEnd"/>
           </w:p>
         </w:tc>
         <w:tc>
@@ -817,11 +752,33 @@
                 <w:rFonts w:ascii="Times New Roman" w:hAnsi="Times New Roman"/>
               </w:rPr>
             </w:pPr>
-            <w:r>
-              <w:rPr>
-                <w:rFonts w:ascii="Times New Roman" w:hAnsi="Times New Roman"/>
-              </w:rPr>
-              <w:t>Kính gửi:</w:t>
+            <w:proofErr w:type="spellStart"/>
+            <w:r>
+              <w:rPr>
+                <w:rFonts w:ascii="Times New Roman" w:hAnsi="Times New Roman"/>
+              </w:rPr>
+              <w:t>Kính</w:t>
+            </w:r>
+            <w:proofErr w:type="spellEnd"/>
+            <w:r>
+              <w:rPr>
+                <w:rFonts w:ascii="Times New Roman" w:hAnsi="Times New Roman"/>
+              </w:rPr>
+              <w:t xml:space="preserve"> </w:t>
+            </w:r>
+            <w:proofErr w:type="spellStart"/>
+            <w:r>
+              <w:rPr>
+                <w:rFonts w:ascii="Times New Roman" w:hAnsi="Times New Roman"/>
+              </w:rPr>
+              <w:t>gửi</w:t>
+            </w:r>
+            <w:proofErr w:type="spellEnd"/>
+            <w:r>
+              <w:rPr>
+                <w:rFonts w:ascii="Times New Roman" w:hAnsi="Times New Roman"/>
+              </w:rPr>
+              <w:t>:</w:t>
             </w:r>
           </w:p>
         </w:tc>
@@ -884,6 +841,7 @@
         </w:rPr>
         <w:t>(</w:t>
       </w:r>
+      <w:proofErr w:type="gramStart"/>
       <w:r>
         <w:rPr>
           <w:rFonts w:ascii="Times New Roman" w:hAnsi="Times New Roman"/>
@@ -904,6 +862,7 @@
         </w:rPr>
         <w:t>..............................................................................................................................................................................................................................................................................................................</w:t>
       </w:r>
+      <w:proofErr w:type="gramEnd"/>
     </w:p>
     <w:p>
       <w:pPr>
@@ -981,21 +940,13 @@
         <w:tblLook w:val="0000" w:firstRow="0" w:lastRow="0" w:firstColumn="0" w:lastColumn="0" w:noHBand="0" w:noVBand="0"/>
       </w:tblPr>
       <w:tblGrid>
-        <w:gridCol w:w="113"/>
-        <w:gridCol w:w="3510"/>
-        <w:gridCol w:w="5812"/>
+        <w:gridCol w:w="3553"/>
+        <w:gridCol w:w="5882"/>
       </w:tblGrid>
       <w:tr>
-        <w:trPr>
-          <w:gridBefore w:val="1"/>
-          <w:wBefore w:w="113" w:type="dxa"/>
-        </w:trPr>
         <w:tc>
           <w:tcPr>
-            <w:tcW w:w="3510" w:type="dxa"/>
-            <w:tcBorders>
-              <w:bottom w:val="single" w:sz="4" w:space="0" w:color="auto"/>
-            </w:tcBorders>
+            <w:tcW w:w="3553" w:type="dxa"/>
           </w:tcPr>
           <w:p>
             <w:pPr>
@@ -1006,6 +957,7 @@
                 <w:sz w:val="24"/>
               </w:rPr>
             </w:pPr>
+            <w:proofErr w:type="spellStart"/>
             <w:r>
               <w:rPr>
                 <w:rFonts w:ascii="Times New Roman" w:hAnsi="Times New Roman"/>
@@ -1031,7 +983,37 @@
                 <w:i/>
                 <w:sz w:val="24"/>
               </w:rPr>
-              <w:t>i nhận:</w:t>
+              <w:t>i</w:t>
+            </w:r>
+            <w:proofErr w:type="spellEnd"/>
+            <w:r>
+              <w:rPr>
+                <w:rFonts w:ascii="Times New Roman" w:hAnsi="Times New Roman"/>
+                <w:b/>
+                <w:i/>
+                <w:sz w:val="24"/>
+              </w:rPr>
+              <w:t xml:space="preserve"> </w:t>
+            </w:r>
+            <w:proofErr w:type="spellStart"/>
+            <w:r>
+              <w:rPr>
+                <w:rFonts w:ascii="Times New Roman" w:hAnsi="Times New Roman"/>
+                <w:b/>
+                <w:i/>
+                <w:sz w:val="24"/>
+              </w:rPr>
+              <w:t>nhận</w:t>
+            </w:r>
+            <w:proofErr w:type="spellEnd"/>
+            <w:r>
+              <w:rPr>
+                <w:rFonts w:ascii="Times New Roman" w:hAnsi="Times New Roman"/>
+                <w:b/>
+                <w:i/>
+                <w:sz w:val="24"/>
+              </w:rPr>
+              <w:t>:</w:t>
             </w:r>
           </w:p>
           <w:p>
@@ -1060,7 +1042,23 @@
                 <w:rFonts w:ascii="Times New Roman" w:hAnsi="Times New Roman"/>
                 <w:sz w:val="22"/>
               </w:rPr>
-              <w:t xml:space="preserve"> trên;</w:t>
+              <w:t xml:space="preserve"> </w:t>
+            </w:r>
+            <w:proofErr w:type="spellStart"/>
+            <w:r>
+              <w:rPr>
+                <w:rFonts w:ascii="Times New Roman" w:hAnsi="Times New Roman"/>
+                <w:sz w:val="22"/>
+              </w:rPr>
+              <w:t>trên</w:t>
+            </w:r>
+            <w:proofErr w:type="spellEnd"/>
+            <w:r>
+              <w:rPr>
+                <w:rFonts w:ascii="Times New Roman" w:hAnsi="Times New Roman"/>
+                <w:sz w:val="22"/>
+              </w:rPr>
+              <w:t>;</w:t>
             </w:r>
           </w:p>
           <w:p>
@@ -1104,7 +1102,15 @@
                 <w:rFonts w:ascii="Times New Roman" w:hAnsi="Times New Roman"/>
                 <w:sz w:val="22"/>
               </w:rPr>
-              <w:t>u: VT, ...</w:t>
+              <w:t xml:space="preserve">u: VT, </w:t>
+            </w:r>
+            <w:proofErr w:type="gramStart"/>
+            <w:r>
+              <w:rPr>
+                <w:rFonts w:ascii="Times New Roman" w:hAnsi="Times New Roman"/>
+                <w:sz w:val="22"/>
+              </w:rPr>
+              <w:t>...</w:t>
             </w:r>
             <w:r>
               <w:rPr>
@@ -1113,6 +1119,7 @@
               </w:rPr>
               <w:t>(</w:t>
             </w:r>
+            <w:proofErr w:type="gramEnd"/>
             <w:r>
               <w:rPr>
                 <w:rFonts w:ascii="Times New Roman" w:hAnsi="Times New Roman"/>
@@ -1141,6 +1148,7 @@
               </w:rPr>
               <w:t xml:space="preserve"> </w:t>
             </w:r>
+            <w:proofErr w:type="gramStart"/>
             <w:r>
               <w:rPr>
                 <w:rFonts w:ascii="Times New Roman" w:hAnsi="Times New Roman"/>
@@ -1148,6 +1156,7 @@
               </w:rPr>
               <w:t>XX(</w:t>
             </w:r>
+            <w:proofErr w:type="gramEnd"/>
             <w:r>
               <w:rPr>
                 <w:rFonts w:ascii="Times New Roman" w:hAnsi="Times New Roman"/>
@@ -1185,6 +1194,7 @@
                 <w:sz w:val="22"/>
               </w:rPr>
             </w:pPr>
+            <w:proofErr w:type="spellStart"/>
             <w:r>
               <w:rPr>
                 <w:rFonts w:ascii="Times New Roman" w:hAnsi="Times New Roman"/>
@@ -1192,8 +1202,9 @@
                 <w:bCs/>
                 <w:sz w:val="24"/>
               </w:rPr>
-              <w:t>Số eOffice: ..(</w:t>
-            </w:r>
+              <w:t>Số</w:t>
+            </w:r>
+            <w:proofErr w:type="spellEnd"/>
             <w:r>
               <w:rPr>
                 <w:rFonts w:ascii="Times New Roman" w:hAnsi="Times New Roman"/>
@@ -1201,8 +1212,10 @@
                 <w:bCs/>
                 <w:sz w:val="24"/>
               </w:rPr>
-              <w:t>8</w:t>
-            </w:r>
+              <w:t xml:space="preserve"> </w:t>
+            </w:r>
+            <w:proofErr w:type="spellStart"/>
+            <w:proofErr w:type="gramStart"/>
             <w:r>
               <w:rPr>
                 <w:rFonts w:ascii="Times New Roman" w:hAnsi="Times New Roman"/>
@@ -1210,7 +1223,56 @@
                 <w:bCs/>
                 <w:sz w:val="24"/>
               </w:rPr>
-              <w:t>)..-</w:t>
+              <w:t>eOffice</w:t>
+            </w:r>
+            <w:proofErr w:type="spellEnd"/>
+            <w:r>
+              <w:rPr>
+                <w:rFonts w:ascii="Times New Roman" w:hAnsi="Times New Roman"/>
+                <w:b/>
+                <w:bCs/>
+                <w:sz w:val="24"/>
+              </w:rPr>
+              <w:t>: ..</w:t>
+            </w:r>
+            <w:proofErr w:type="gramEnd"/>
+            <w:r>
+              <w:rPr>
+                <w:rFonts w:ascii="Times New Roman" w:hAnsi="Times New Roman"/>
+                <w:b/>
+                <w:bCs/>
+                <w:sz w:val="24"/>
+              </w:rPr>
+              <w:t>(</w:t>
+            </w:r>
+            <w:r>
+              <w:rPr>
+                <w:rFonts w:ascii="Times New Roman" w:hAnsi="Times New Roman"/>
+                <w:b/>
+                <w:bCs/>
+                <w:sz w:val="24"/>
+              </w:rPr>
+              <w:t>8</w:t>
+            </w:r>
+            <w:proofErr w:type="gramStart"/>
+            <w:r>
+              <w:rPr>
+                <w:rFonts w:ascii="Times New Roman" w:hAnsi="Times New Roman"/>
+                <w:b/>
+                <w:bCs/>
+                <w:sz w:val="24"/>
+              </w:rPr>
+              <w:t>)..</w:t>
+            </w:r>
+            <w:proofErr w:type="gramEnd"/>
+            <w:r>
+              <w:rPr>
+                <w:rFonts w:ascii="Times New Roman" w:hAnsi="Times New Roman"/>
+                <w:b/>
+                <w:bCs/>
+                <w:sz w:val="24"/>
+              </w:rPr>
+              <w:t>-</w:t>
             </w:r>
             <w:r>
               <w:rPr>
@@ -1234,10 +1296,7 @@
         </w:tc>
         <w:tc>
           <w:tcPr>
-            <w:tcW w:w="5812" w:type="dxa"/>
-            <w:tcBorders>
-              <w:bottom w:val="single" w:sz="4" w:space="0" w:color="auto"/>
-            </w:tcBorders>
+            <w:tcW w:w="5882" w:type="dxa"/>
           </w:tcPr>
           <w:p>
             <w:pPr>
@@ -1341,24 +1400,62 @@
                 <w:bCs/>
                 <w:i/>
               </w:rPr>
-              <w:t>(ký,</w:t>
-            </w:r>
+              <w:t>(</w:t>
+            </w:r>
+            <w:proofErr w:type="spellStart"/>
             <w:r>
               <w:rPr>
                 <w:rFonts w:ascii="Times New Roman" w:hAnsi="Times New Roman"/>
                 <w:bCs/>
                 <w:i/>
               </w:rPr>
-              <w:t xml:space="preserve"> đóng</w:t>
-            </w:r>
+              <w:t>ký</w:t>
+            </w:r>
+            <w:proofErr w:type="spellEnd"/>
             <w:r>
               <w:rPr>
                 <w:rFonts w:ascii="Times New Roman" w:hAnsi="Times New Roman"/>
                 <w:bCs/>
                 <w:i/>
               </w:rPr>
-              <w:t xml:space="preserve"> dấu</w:t>
-            </w:r>
+              <w:t>,</w:t>
+            </w:r>
+            <w:r>
+              <w:rPr>
+                <w:rFonts w:ascii="Times New Roman" w:hAnsi="Times New Roman"/>
+                <w:bCs/>
+                <w:i/>
+              </w:rPr>
+              <w:t xml:space="preserve"> </w:t>
+            </w:r>
+            <w:proofErr w:type="spellStart"/>
+            <w:r>
+              <w:rPr>
+                <w:rFonts w:ascii="Times New Roman" w:hAnsi="Times New Roman"/>
+                <w:bCs/>
+                <w:i/>
+              </w:rPr>
+              <w:t>đóng</w:t>
+            </w:r>
+            <w:proofErr w:type="spellEnd"/>
+            <w:r>
+              <w:rPr>
+                <w:rFonts w:ascii="Times New Roman" w:hAnsi="Times New Roman"/>
+                <w:bCs/>
+                <w:i/>
+              </w:rPr>
+              <w:t xml:space="preserve"> </w:t>
+            </w:r>
+            <w:proofErr w:type="spellStart"/>
+            <w:r>
+              <w:rPr>
+                <w:rFonts w:ascii="Times New Roman" w:hAnsi="Times New Roman"/>
+                <w:bCs/>
+                <w:i/>
+              </w:rPr>
+              <w:t>dấu</w:t>
+            </w:r>
+            <w:proofErr w:type="spellEnd"/>
             <w:r>
               <w:rPr>
                 <w:rFonts w:ascii="Times New Roman" w:hAnsi="Times New Roman"/>
@@ -1399,12 +1496,42 @@
                 <w:rFonts w:ascii="Times New Roman" w:hAnsi="Times New Roman"/>
               </w:rPr>
             </w:pPr>
-            <w:r>
-              <w:rPr>
-                <w:rFonts w:ascii="Times New Roman" w:hAnsi="Times New Roman"/>
-              </w:rPr>
-              <w:t>Họ và tên</w:t>
-            </w:r>
+            <w:proofErr w:type="spellStart"/>
+            <w:r>
+              <w:rPr>
+                <w:rFonts w:ascii="Times New Roman" w:hAnsi="Times New Roman"/>
+              </w:rPr>
+              <w:t>Họ</w:t>
+            </w:r>
+            <w:proofErr w:type="spellEnd"/>
+            <w:r>
+              <w:rPr>
+                <w:rFonts w:ascii="Times New Roman" w:hAnsi="Times New Roman"/>
+              </w:rPr>
+              <w:t xml:space="preserve"> </w:t>
+            </w:r>
+            <w:proofErr w:type="spellStart"/>
+            <w:r>
+              <w:rPr>
+                <w:rFonts w:ascii="Times New Roman" w:hAnsi="Times New Roman"/>
+              </w:rPr>
+              <w:t>và</w:t>
+            </w:r>
+            <w:proofErr w:type="spellEnd"/>
+            <w:r>
+              <w:rPr>
+                <w:rFonts w:ascii="Times New Roman" w:hAnsi="Times New Roman"/>
+              </w:rPr>
+              <w:t xml:space="preserve"> </w:t>
+            </w:r>
+            <w:proofErr w:type="spellStart"/>
+            <w:r>
+              <w:rPr>
+                <w:rFonts w:ascii="Times New Roman" w:hAnsi="Times New Roman"/>
+              </w:rPr>
+              <w:t>tên</w:t>
+            </w:r>
+            <w:proofErr w:type="spellEnd"/>
             <w:r>
               <w:rPr>
                 <w:rFonts w:ascii="Times New Roman" w:hAnsi="Times New Roman"/>
@@ -1415,19 +1542,9 @@
         </w:tc>
       </w:tr>
       <w:tr>
-        <w:tblPrEx>
-          <w:tblBorders>
-            <w:top w:val="single" w:sz="8" w:space="0" w:color="auto"/>
-          </w:tblBorders>
-        </w:tblPrEx>
-        <w:trPr>
-          <w:gridBefore w:val="1"/>
-          <w:wBefore w:w="113" w:type="dxa"/>
-        </w:trPr>
         <w:tc>
           <w:tcPr>
-            <w:tcW w:w="9322" w:type="dxa"/>
-            <w:gridSpan w:val="2"/>
+            <w:tcW w:w="3553" w:type="dxa"/>
           </w:tcPr>
           <w:p>
             <w:pPr>
@@ -1435,730 +1552,32 @@
                 <w:rFonts w:ascii="Times New Roman" w:hAnsi="Times New Roman"/>
                 <w:b/>
                 <w:i/>
-                <w:sz w:val="22"/>
-                <w:szCs w:val="22"/>
+                <w:sz w:val="24"/>
               </w:rPr>
             </w:pPr>
-            <w:r>
-              <w:rPr>
-                <w:rFonts w:ascii="Times New Roman" w:hAnsi="Times New Roman"/>
-                <w:b/>
-                <w:i/>
-                <w:sz w:val="22"/>
-                <w:szCs w:val="22"/>
-              </w:rPr>
-              <w:t>Ghi chú:</w:t>
-            </w:r>
           </w:p>
+        </w:tc>
+        <w:tc>
+          <w:tcPr>
+            <w:tcW w:w="5882" w:type="dxa"/>
+          </w:tcPr>
           <w:p>
             <w:pPr>
+              <w:ind w:right="-1"/>
+              <w:jc w:val="center"/>
               <w:rPr>
                 <w:rFonts w:ascii="Times New Roman" w:hAnsi="Times New Roman"/>
                 <w:b/>
                 <w:bCs/>
-                <w:i/>
-                <w:iCs/>
-                <w:sz w:val="22"/>
-                <w:szCs w:val="22"/>
-                <w:lang w:val="en-GB" w:eastAsia="zh-CN"/>
-              </w:rPr>
-            </w:pPr>
-            <w:r>
-              <w:rPr>
-                <w:rFonts w:ascii="Times New Roman" w:hAnsi="Times New Roman"/>
-                <w:b/>
-                <w:bCs/>
-                <w:i/>
-                <w:iCs/>
-                <w:sz w:val="22"/>
-                <w:szCs w:val="22"/>
-                <w:lang w:val="en-GB" w:eastAsia="zh-CN"/>
-              </w:rPr>
-              <w:t>* Các phần ghi: số: ký hiệu, ngày, tháng, năm của văn bản (để trống</w:t>
-            </w:r>
-            <w:r>
-              <w:rPr>
-                <w:rFonts w:ascii="Times New Roman" w:hAnsi="Times New Roman"/>
-                <w:b/>
-                <w:bCs/>
-                <w:i/>
-                <w:iCs/>
-                <w:sz w:val="22"/>
-                <w:szCs w:val="22"/>
-                <w:lang w:val="en-GB" w:eastAsia="zh-CN"/>
-              </w:rPr>
-              <w:t xml:space="preserve"> để hệ thống tự cập nhật</w:t>
-            </w:r>
-            <w:r>
-              <w:rPr>
-                <w:rFonts w:ascii="Times New Roman" w:hAnsi="Times New Roman"/>
-                <w:b/>
-                <w:bCs/>
-                <w:i/>
-                <w:iCs/>
-                <w:sz w:val="22"/>
-                <w:szCs w:val="22"/>
-                <w:lang w:val="en-GB" w:eastAsia="zh-CN"/>
-              </w:rPr>
-              <w:t>).</w:t>
-            </w:r>
-          </w:p>
-          <w:p>
-            <w:pPr>
-              <w:jc w:val="both"/>
-              <w:rPr>
-                <w:rFonts w:ascii="Times New Roman" w:hAnsi="Times New Roman"/>
-                <w:b/>
-                <w:bCs/>
-                <w:i/>
-                <w:iCs/>
-                <w:sz w:val="22"/>
-                <w:lang w:val="en-GB"/>
-              </w:rPr>
-            </w:pPr>
-            <w:r>
-              <w:rPr>
-                <w:rFonts w:ascii="Times New Roman" w:hAnsi="Times New Roman"/>
-                <w:b/>
-                <w:bCs/>
-                <w:i/>
-                <w:iCs/>
-                <w:sz w:val="22"/>
-                <w:szCs w:val="22"/>
-                <w:lang w:val="en-GB" w:eastAsia="zh-CN"/>
-              </w:rPr>
-              <w:t xml:space="preserve">* Phần đề ký: để khoảng cách (thông thủy) </w:t>
-            </w:r>
-            <w:r>
-              <w:rPr>
-                <w:rFonts w:ascii="Times New Roman" w:hAnsi="Times New Roman"/>
-                <w:b/>
-                <w:bCs/>
-                <w:i/>
-                <w:iCs/>
-                <w:sz w:val="22"/>
-                <w:lang w:val="en-GB"/>
-              </w:rPr>
-              <w:t>từ chân dòng ghi chức vụ bên trên đến dòng ghi họ và tên của người ký văn bản bên dưới từ 4,5cm đến 5 cm)</w:t>
-            </w:r>
-          </w:p>
-          <w:p>
-            <w:pPr>
-              <w:rPr>
-                <w:rFonts w:ascii="Times New Roman" w:hAnsi="Times New Roman"/>
-                <w:sz w:val="22"/>
-                <w:szCs w:val="22"/>
-              </w:rPr>
-            </w:pPr>
-            <w:r>
-              <w:rPr>
-                <w:rFonts w:ascii="Times New Roman" w:hAnsi="Times New Roman"/>
-                <w:sz w:val="22"/>
-                <w:szCs w:val="22"/>
-              </w:rPr>
-              <w:t>(</w:t>
-            </w:r>
-            <w:r>
-              <w:rPr>
-                <w:rFonts w:ascii="Times New Roman" w:hAnsi="Times New Roman"/>
-                <w:sz w:val="22"/>
-                <w:szCs w:val="22"/>
-              </w:rPr>
-              <w:t>1</w:t>
-            </w:r>
-            <w:r>
-              <w:rPr>
-                <w:rFonts w:ascii="Times New Roman" w:hAnsi="Times New Roman"/>
-                <w:sz w:val="22"/>
-                <w:szCs w:val="22"/>
-              </w:rPr>
-              <w:t xml:space="preserve">) Tên </w:t>
-            </w:r>
-            <w:r>
-              <w:rPr>
-                <w:rFonts w:ascii="Times New Roman" w:hAnsi="Times New Roman"/>
-                <w:sz w:val="22"/>
-                <w:szCs w:val="22"/>
-              </w:rPr>
-              <w:t>đơn vị ban hành văn bản</w:t>
-            </w:r>
-            <w:r>
-              <w:rPr>
-                <w:rFonts w:ascii="Times New Roman" w:hAnsi="Times New Roman"/>
-                <w:sz w:val="22"/>
-                <w:szCs w:val="22"/>
-              </w:rPr>
-              <w:t xml:space="preserve"> (</w:t>
-            </w:r>
-            <w:r>
-              <w:rPr>
-                <w:rFonts w:ascii="Times New Roman" w:hAnsi="Times New Roman"/>
-                <w:sz w:val="22"/>
-                <w:szCs w:val="22"/>
-              </w:rPr>
-              <w:t>c</w:t>
-            </w:r>
-            <w:r>
-              <w:rPr>
-                <w:rFonts w:ascii="Times New Roman" w:hAnsi="Times New Roman"/>
-                <w:sz w:val="22"/>
-                <w:szCs w:val="22"/>
-              </w:rPr>
-              <w:t>hữ in hoa, đứng</w:t>
-            </w:r>
-            <w:r>
-              <w:rPr>
-                <w:rFonts w:ascii="Times New Roman" w:hAnsi="Times New Roman"/>
-                <w:sz w:val="22"/>
-                <w:szCs w:val="22"/>
-              </w:rPr>
-              <w:t>,</w:t>
-            </w:r>
-            <w:r>
-              <w:rPr>
-                <w:rFonts w:ascii="Times New Roman" w:hAnsi="Times New Roman"/>
-                <w:sz w:val="22"/>
-                <w:szCs w:val="22"/>
-              </w:rPr>
-              <w:t xml:space="preserve"> đậm)</w:t>
-            </w:r>
-            <w:r>
-              <w:rPr>
-                <w:rFonts w:ascii="Times New Roman" w:hAnsi="Times New Roman"/>
-                <w:sz w:val="22"/>
-                <w:szCs w:val="22"/>
-              </w:rPr>
-              <w:t xml:space="preserve"> </w:t>
-            </w:r>
-          </w:p>
-          <w:p>
-            <w:pPr>
-              <w:rPr>
-                <w:rFonts w:ascii="Times New Roman" w:hAnsi="Times New Roman"/>
-                <w:sz w:val="22"/>
-                <w:szCs w:val="22"/>
-              </w:rPr>
-            </w:pPr>
-            <w:r>
-              <w:rPr>
-                <w:rFonts w:ascii="Times New Roman" w:hAnsi="Times New Roman"/>
-                <w:sz w:val="22"/>
-                <w:szCs w:val="22"/>
-              </w:rPr>
-              <w:t>(</w:t>
-            </w:r>
-            <w:r>
-              <w:rPr>
-                <w:rFonts w:ascii="Times New Roman" w:hAnsi="Times New Roman"/>
-                <w:sz w:val="22"/>
-                <w:szCs w:val="22"/>
-              </w:rPr>
-              <w:t>2</w:t>
-            </w:r>
-            <w:r>
-              <w:rPr>
-                <w:rFonts w:ascii="Times New Roman" w:hAnsi="Times New Roman"/>
-                <w:sz w:val="22"/>
-                <w:szCs w:val="22"/>
-              </w:rPr>
-              <w:t xml:space="preserve">) </w:t>
-            </w:r>
-            <w:r>
-              <w:rPr>
-                <w:rFonts w:ascii="Times New Roman" w:hAnsi="Times New Roman"/>
-                <w:sz w:val="22"/>
-                <w:szCs w:val="22"/>
-              </w:rPr>
-              <w:t>Ghi đ</w:t>
-            </w:r>
-            <w:r>
-              <w:rPr>
-                <w:rFonts w:ascii="Times New Roman" w:hAnsi="Times New Roman"/>
-                <w:sz w:val="22"/>
-                <w:szCs w:val="22"/>
-              </w:rPr>
-              <w:t>ịa danh.</w:t>
-            </w:r>
-          </w:p>
-          <w:p>
-            <w:pPr>
-              <w:rPr>
-                <w:rFonts w:ascii="Times New Roman" w:hAnsi="Times New Roman"/>
-                <w:sz w:val="22"/>
-                <w:szCs w:val="22"/>
-              </w:rPr>
-            </w:pPr>
-            <w:r>
-              <w:rPr>
-                <w:rFonts w:ascii="Times New Roman" w:hAnsi="Times New Roman"/>
-                <w:sz w:val="22"/>
-                <w:szCs w:val="22"/>
-              </w:rPr>
-              <w:t>(</w:t>
-            </w:r>
-            <w:r>
-              <w:rPr>
-                <w:rFonts w:ascii="Times New Roman" w:hAnsi="Times New Roman"/>
-                <w:sz w:val="22"/>
-                <w:szCs w:val="22"/>
-              </w:rPr>
-              <w:t>3</w:t>
-            </w:r>
-            <w:r>
-              <w:rPr>
-                <w:rFonts w:ascii="Times New Roman" w:hAnsi="Times New Roman"/>
-                <w:sz w:val="22"/>
-                <w:szCs w:val="22"/>
-              </w:rPr>
-              <w:t xml:space="preserve">) Trích yếu nội dung </w:t>
-            </w:r>
-            <w:r>
-              <w:rPr>
-                <w:rFonts w:ascii="Times New Roman" w:hAnsi="Times New Roman"/>
-                <w:sz w:val="22"/>
-                <w:szCs w:val="22"/>
-              </w:rPr>
-              <w:t>văn bản</w:t>
-            </w:r>
-            <w:r>
-              <w:rPr>
-                <w:rFonts w:ascii="Times New Roman" w:hAnsi="Times New Roman"/>
-                <w:sz w:val="22"/>
-                <w:szCs w:val="22"/>
-              </w:rPr>
-              <w:t xml:space="preserve"> (</w:t>
-            </w:r>
-            <w:r>
-              <w:rPr>
-                <w:rFonts w:ascii="Times New Roman" w:hAnsi="Times New Roman"/>
-                <w:sz w:val="22"/>
-                <w:szCs w:val="22"/>
-              </w:rPr>
-              <w:t>c</w:t>
-            </w:r>
-            <w:r>
-              <w:rPr>
-                <w:rFonts w:ascii="Times New Roman" w:hAnsi="Times New Roman"/>
-                <w:sz w:val="22"/>
-                <w:szCs w:val="22"/>
-              </w:rPr>
-              <w:t xml:space="preserve">hữ thường, </w:t>
-            </w:r>
-            <w:r>
-              <w:rPr>
-                <w:rFonts w:ascii="Times New Roman" w:hAnsi="Times New Roman"/>
-                <w:sz w:val="22"/>
-                <w:szCs w:val="22"/>
-              </w:rPr>
-              <w:t>đứng</w:t>
-            </w:r>
-            <w:r>
-              <w:rPr>
-                <w:rFonts w:ascii="Times New Roman" w:hAnsi="Times New Roman"/>
-                <w:sz w:val="22"/>
-                <w:szCs w:val="22"/>
-              </w:rPr>
-              <w:t>).</w:t>
-            </w:r>
-          </w:p>
-          <w:p>
-            <w:pPr>
-              <w:rPr>
-                <w:rFonts w:ascii="Times New Roman" w:hAnsi="Times New Roman"/>
-                <w:sz w:val="22"/>
-                <w:szCs w:val="22"/>
-              </w:rPr>
-            </w:pPr>
-            <w:r>
-              <w:rPr>
-                <w:rFonts w:ascii="Times New Roman" w:hAnsi="Times New Roman"/>
-                <w:sz w:val="22"/>
-                <w:szCs w:val="22"/>
-              </w:rPr>
-              <w:t>(</w:t>
-            </w:r>
-            <w:r>
-              <w:rPr>
-                <w:rFonts w:ascii="Times New Roman" w:hAnsi="Times New Roman"/>
-                <w:sz w:val="22"/>
-                <w:szCs w:val="22"/>
-              </w:rPr>
-              <w:t>4</w:t>
-            </w:r>
-            <w:r>
-              <w:rPr>
-                <w:rFonts w:ascii="Times New Roman" w:hAnsi="Times New Roman"/>
-                <w:sz w:val="22"/>
-                <w:szCs w:val="22"/>
-              </w:rPr>
-              <w:t xml:space="preserve">) Nội dung </w:t>
-            </w:r>
-            <w:r>
-              <w:rPr>
-                <w:rFonts w:ascii="Times New Roman" w:hAnsi="Times New Roman"/>
-                <w:sz w:val="22"/>
-                <w:szCs w:val="22"/>
-              </w:rPr>
-              <w:t>văn bản</w:t>
-            </w:r>
-            <w:r>
-              <w:rPr>
-                <w:rFonts w:ascii="Times New Roman" w:hAnsi="Times New Roman"/>
-                <w:sz w:val="22"/>
-                <w:szCs w:val="22"/>
-              </w:rPr>
-              <w:t>.</w:t>
-            </w:r>
-          </w:p>
-          <w:p>
-            <w:pPr>
-              <w:rPr>
-                <w:rFonts w:ascii="Times New Roman" w:hAnsi="Times New Roman"/>
-                <w:sz w:val="22"/>
-                <w:szCs w:val="22"/>
-              </w:rPr>
-            </w:pPr>
-            <w:r>
-              <w:rPr>
-                <w:rFonts w:ascii="Times New Roman" w:hAnsi="Times New Roman"/>
-                <w:sz w:val="22"/>
-                <w:szCs w:val="22"/>
-              </w:rPr>
-              <w:t>(</w:t>
-            </w:r>
-            <w:r>
-              <w:rPr>
-                <w:rFonts w:ascii="Times New Roman" w:hAnsi="Times New Roman"/>
-                <w:sz w:val="22"/>
-                <w:szCs w:val="22"/>
-              </w:rPr>
-              <w:t>5</w:t>
-            </w:r>
-            <w:r>
-              <w:rPr>
-                <w:rFonts w:ascii="Times New Roman" w:hAnsi="Times New Roman"/>
-                <w:sz w:val="22"/>
-                <w:szCs w:val="22"/>
-              </w:rPr>
-              <w:t>) Ghi quyền hạn, chức vụ của người ký (</w:t>
-            </w:r>
-            <w:r>
-              <w:rPr>
-                <w:rFonts w:ascii="Times New Roman" w:hAnsi="Times New Roman"/>
-                <w:sz w:val="22"/>
-                <w:szCs w:val="22"/>
-              </w:rPr>
-              <w:t>c</w:t>
-            </w:r>
-            <w:r>
-              <w:rPr>
-                <w:rFonts w:ascii="Times New Roman" w:hAnsi="Times New Roman"/>
-                <w:sz w:val="22"/>
-                <w:szCs w:val="22"/>
-              </w:rPr>
-              <w:t>hữ in hoa, đứng</w:t>
-            </w:r>
-            <w:r>
-              <w:rPr>
-                <w:rFonts w:ascii="Times New Roman" w:hAnsi="Times New Roman"/>
-                <w:sz w:val="22"/>
-                <w:szCs w:val="22"/>
-              </w:rPr>
-              <w:t>,</w:t>
-            </w:r>
-            <w:r>
-              <w:rPr>
-                <w:rFonts w:ascii="Times New Roman" w:hAnsi="Times New Roman"/>
-                <w:sz w:val="22"/>
-                <w:szCs w:val="22"/>
-              </w:rPr>
-              <w:t xml:space="preserve"> đậm).</w:t>
-            </w:r>
-          </w:p>
-          <w:p>
-            <w:pPr>
-              <w:pStyle w:val="BodyTextIndent"/>
-              <w:spacing w:after="0"/>
-              <w:ind w:firstLine="0"/>
-              <w:rPr>
-                <w:rFonts w:ascii="Times New Roman" w:hAnsi="Times New Roman"/>
-                <w:b/>
-                <w:sz w:val="22"/>
-                <w:szCs w:val="22"/>
-              </w:rPr>
-            </w:pPr>
-            <w:r>
-              <w:rPr>
-                <w:rFonts w:ascii="Times New Roman" w:hAnsi="Times New Roman"/>
-                <w:sz w:val="22"/>
-                <w:szCs w:val="22"/>
-              </w:rPr>
-              <w:t>Trường hợp</w:t>
-            </w:r>
-            <w:r>
-              <w:rPr>
-                <w:rFonts w:ascii="Times New Roman" w:hAnsi="Times New Roman"/>
-                <w:sz w:val="22"/>
-                <w:szCs w:val="22"/>
-              </w:rPr>
-              <w:t xml:space="preserve"> cấp</w:t>
-            </w:r>
-            <w:r>
-              <w:rPr>
-                <w:rFonts w:ascii="Times New Roman" w:hAnsi="Times New Roman"/>
-                <w:sz w:val="22"/>
-                <w:szCs w:val="22"/>
-              </w:rPr>
-              <w:t xml:space="preserve"> Phó ký thay </w:t>
-            </w:r>
-            <w:r>
-              <w:rPr>
-                <w:rFonts w:ascii="Times New Roman" w:hAnsi="Times New Roman"/>
-                <w:sz w:val="22"/>
-                <w:szCs w:val="22"/>
-              </w:rPr>
-              <w:t>cấp Trưởng</w:t>
-            </w:r>
-            <w:r>
-              <w:rPr>
-                <w:rFonts w:ascii="Times New Roman" w:hAnsi="Times New Roman"/>
-                <w:sz w:val="22"/>
-                <w:szCs w:val="22"/>
-              </w:rPr>
-              <w:t xml:space="preserve"> thì ghi:</w:t>
-            </w:r>
-            <w:r>
-              <w:rPr>
-                <w:rFonts w:ascii="Times New Roman" w:hAnsi="Times New Roman"/>
-                <w:sz w:val="22"/>
-                <w:szCs w:val="22"/>
-              </w:rPr>
-              <w:t xml:space="preserve">       </w:t>
-            </w:r>
-            <w:r>
-              <w:rPr>
-                <w:rFonts w:ascii="Times New Roman" w:hAnsi="Times New Roman"/>
-                <w:sz w:val="22"/>
-                <w:szCs w:val="22"/>
-              </w:rPr>
-              <w:t xml:space="preserve"> </w:t>
-            </w:r>
-            <w:r>
-              <w:rPr>
-                <w:rFonts w:ascii="Times New Roman" w:hAnsi="Times New Roman"/>
-                <w:b/>
-                <w:sz w:val="22"/>
-                <w:szCs w:val="22"/>
-              </w:rPr>
-              <w:t>KT. GIÁM ĐỐC</w:t>
-            </w:r>
-          </w:p>
-          <w:p>
-            <w:pPr>
-              <w:pStyle w:val="BodyTextIndent"/>
-              <w:spacing w:after="0"/>
-              <w:ind w:firstLine="0"/>
-              <w:rPr>
-                <w:rFonts w:ascii="Times New Roman" w:hAnsi="Times New Roman"/>
-                <w:b/>
-                <w:sz w:val="22"/>
-                <w:szCs w:val="22"/>
-              </w:rPr>
-            </w:pPr>
-            <w:r>
-              <w:rPr>
-                <w:rFonts w:ascii="Times New Roman" w:hAnsi="Times New Roman"/>
-                <w:b/>
-                <w:sz w:val="22"/>
-                <w:szCs w:val="22"/>
-              </w:rPr>
-              <w:t xml:space="preserve">                                                                                     PHÓ GIÁM ĐỐC</w:t>
-            </w:r>
-          </w:p>
-          <w:p>
-            <w:pPr>
-              <w:rPr>
-                <w:rFonts w:ascii="Times New Roman" w:hAnsi="Times New Roman"/>
-                <w:sz w:val="22"/>
-                <w:szCs w:val="22"/>
-                <w:lang w:val="en-US"/>
-              </w:rPr>
-            </w:pPr>
-            <w:r>
-              <w:rPr>
-                <w:rFonts w:ascii="Times New Roman" w:hAnsi="Times New Roman"/>
-                <w:sz w:val="22"/>
-                <w:szCs w:val="22"/>
-                <w:lang w:val="en-US"/>
-              </w:rPr>
-              <w:t>(</w:t>
-            </w:r>
-            <w:r>
-              <w:rPr>
-                <w:rFonts w:ascii="Times New Roman" w:hAnsi="Times New Roman"/>
-                <w:sz w:val="22"/>
-                <w:szCs w:val="22"/>
-                <w:lang w:val="en-US"/>
-              </w:rPr>
-              <w:t>6</w:t>
-            </w:r>
-            <w:r>
-              <w:rPr>
-                <w:rFonts w:ascii="Times New Roman" w:hAnsi="Times New Roman"/>
-                <w:sz w:val="22"/>
-                <w:szCs w:val="22"/>
-                <w:lang w:val="en-US"/>
-              </w:rPr>
-              <w:t xml:space="preserve">) </w:t>
-            </w:r>
-            <w:r>
-              <w:rPr>
-                <w:rFonts w:ascii="Times New Roman" w:hAnsi="Times New Roman"/>
-                <w:spacing w:val="-2"/>
-                <w:sz w:val="22"/>
-                <w:szCs w:val="22"/>
-                <w:lang w:val="en-US"/>
-              </w:rPr>
-              <w:t>Chữ viết tắt tên đơn vị chủ trì soạn thảo và số lượng bản lưu (nếu cần).</w:t>
-            </w:r>
-          </w:p>
-          <w:p>
-            <w:pPr>
-              <w:rPr>
-                <w:rFonts w:ascii="Times New Roman" w:hAnsi="Times New Roman"/>
-                <w:sz w:val="22"/>
-                <w:szCs w:val="22"/>
-                <w:lang w:val="en-US"/>
-              </w:rPr>
-            </w:pPr>
-            <w:r>
-              <w:rPr>
-                <w:rFonts w:ascii="Times New Roman" w:hAnsi="Times New Roman"/>
-                <w:sz w:val="22"/>
-                <w:szCs w:val="22"/>
-                <w:lang w:val="en-US"/>
-              </w:rPr>
-              <w:t>(</w:t>
-            </w:r>
-            <w:r>
-              <w:rPr>
-                <w:rFonts w:ascii="Times New Roman" w:hAnsi="Times New Roman"/>
-                <w:sz w:val="22"/>
-                <w:szCs w:val="22"/>
-                <w:lang w:val="en-US"/>
-              </w:rPr>
-              <w:t>7</w:t>
-            </w:r>
-            <w:r>
-              <w:rPr>
-                <w:rFonts w:ascii="Times New Roman" w:hAnsi="Times New Roman"/>
-                <w:sz w:val="22"/>
-                <w:szCs w:val="22"/>
-                <w:lang w:val="en-US"/>
-              </w:rPr>
-              <w:t>) Ký hiệu</w:t>
-            </w:r>
-            <w:r>
-              <w:rPr>
-                <w:rFonts w:ascii="Times New Roman" w:hAnsi="Times New Roman"/>
-                <w:sz w:val="22"/>
-                <w:szCs w:val="22"/>
-                <w:lang w:val="en-US"/>
-              </w:rPr>
-              <w:t xml:space="preserve"> của</w:t>
-            </w:r>
-            <w:r>
-              <w:rPr>
-                <w:rFonts w:ascii="Times New Roman" w:hAnsi="Times New Roman"/>
-                <w:sz w:val="22"/>
-                <w:szCs w:val="22"/>
-                <w:lang w:val="en-US"/>
-              </w:rPr>
-              <w:t xml:space="preserve"> người </w:t>
-            </w:r>
-            <w:r>
-              <w:rPr>
-                <w:rFonts w:ascii="Times New Roman" w:hAnsi="Times New Roman"/>
-                <w:sz w:val="22"/>
-                <w:szCs w:val="22"/>
-                <w:lang w:val="en-US"/>
-              </w:rPr>
-              <w:t>soạn thảo</w:t>
-            </w:r>
-            <w:r>
-              <w:rPr>
-                <w:rFonts w:ascii="Times New Roman" w:hAnsi="Times New Roman"/>
-                <w:sz w:val="22"/>
-                <w:szCs w:val="22"/>
-                <w:lang w:val="en-US"/>
-              </w:rPr>
-              <w:t xml:space="preserve"> và số lượng bản phát hành.</w:t>
-            </w:r>
-          </w:p>
-          <w:p>
-            <w:pPr>
-              <w:pStyle w:val="FootnoteText"/>
-              <w:jc w:val="both"/>
-              <w:rPr>
-                <w:sz w:val="22"/>
-                <w:szCs w:val="22"/>
-              </w:rPr>
-            </w:pPr>
-            <w:r>
-              <w:rPr>
-                <w:sz w:val="22"/>
-                <w:szCs w:val="22"/>
-              </w:rPr>
-              <w:t>(</w:t>
-            </w:r>
-            <w:r>
-              <w:rPr>
-                <w:sz w:val="22"/>
-                <w:szCs w:val="22"/>
-              </w:rPr>
-              <w:t>8</w:t>
-            </w:r>
-            <w:r>
-              <w:rPr>
-                <w:sz w:val="22"/>
-                <w:szCs w:val="22"/>
-              </w:rPr>
-              <w:t>) Ghi số eOffice.</w:t>
-            </w:r>
-          </w:p>
-          <w:p>
-            <w:pPr>
-              <w:rPr>
-                <w:rFonts w:ascii="Times New Roman" w:hAnsi="Times New Roman"/>
-                <w:sz w:val="22"/>
-                <w:szCs w:val="22"/>
-                <w:lang w:val="en-US"/>
-              </w:rPr>
-            </w:pPr>
-          </w:p>
-          <w:p>
-            <w:pPr>
-              <w:rPr>
-                <w:rFonts w:ascii="Times New Roman" w:hAnsi="Times New Roman"/>
-                <w:sz w:val="22"/>
-                <w:szCs w:val="22"/>
-                <w:lang w:val="en-US"/>
-              </w:rPr>
-            </w:pPr>
-          </w:p>
-          <w:p>
-            <w:pPr>
-              <w:rPr>
-                <w:rFonts w:ascii="Times New Roman" w:hAnsi="Times New Roman"/>
-                <w:sz w:val="22"/>
-                <w:szCs w:val="22"/>
-                <w:lang w:val="en-US"/>
+                <w:spacing w:val="-6"/>
+                <w:szCs w:val="28"/>
               </w:rPr>
             </w:pPr>
           </w:p>
         </w:tc>
       </w:tr>
     </w:tbl>
+    <w:p/>
     <w:sectPr>
       <w:headerReference w:type="default" r:id="rId7"/>
       <w:footerReference w:type="even" r:id="rId8"/>
@@ -2174,7 +1593,7 @@
 </file>
 
 <file path=word/endnotes.xml><?xml version="1.0" encoding="utf-8"?>
-<w:endnotes xmlns:wpc="http://schemas.microsoft.com/office/word/2010/wordprocessingCanvas" xmlns:cx="http://schemas.microsoft.com/office/drawing/2014/chartex" xmlns:cx1="http://schemas.microsoft.com/office/drawing/2015/9/8/chartex" xmlns:cx2="http://schemas.microsoft.com/office/drawing/2015/10/21/chartex" xmlns:cx3="http://schemas.microsoft.com/office/drawing/2016/5/9/chartex" xmlns:cx4="http://schemas.microsoft.com/office/drawing/2016/5/10/chartex" xmlns:cx5="http://schemas.microsoft.com/office/drawing/2016/5/11/chartex" xmlns:cx6="http://schemas.microsoft.com/office/drawing/2016/5/12/chartex" xmlns:cx7="http://schemas.microsoft.com/office/drawing/2016/5/13/chartex" xmlns:cx8="http://schemas.microsoft.com/office/drawing/2016/5/14/chartex" xmlns:mc="http://schemas.openxmlformats.org/markup-compatibility/2006" xmlns:aink="http://schemas.microsoft.com/office/drawing/2016/ink" xmlns:am3d="http://schemas.microsoft.com/office/drawing/2017/model3d" xmlns:o="urn:schemas-microsoft-com:office:office" xmlns:oel="http://schemas.microsoft.com/office/2019/extlst" xmlns:r="http://schemas.openxmlformats.org/officeDocument/2006/relationships" xmlns:m="http://schemas.openxmlformats.org/officeDocument/2006/math" xmlns:v="urn:schemas-microsoft-com:vml" xmlns:wp14="http://schemas.microsoft.com/office/word/2010/wordprocessingDrawing" xmlns:wp="http://schemas.openxmlformats.org/drawingml/2006/wordprocessingDrawing" xmlns:w10="urn:schemas-microsoft-com:office:word" xmlns:w="http://schemas.openxmlformats.org/wordprocessingml/2006/main" xmlns:w14="http://schemas.microsoft.com/office/word/2010/wordml" xmlns:w15="http://schemas.microsoft.com/office/word/2012/wordml" xmlns:w16cex="http://schemas.microsoft.com/office/word/2018/wordml/cex" xmlns:w16cid="http://schemas.microsoft.com/office/word/2016/wordml/cid" xmlns:w16="http://schemas.microsoft.com/office/word/2018/wordml" xmlns:w16du="http://schemas.microsoft.com/office/word/2023/wordml/word16du" xmlns:w16sdtdh="http://schemas.microsoft.com/office/word/2020/wordml/sdtdatahash" xmlns:w16sdtfl="http://schemas.microsoft.com/office/word/2024/wordml/sdtformatlock" xmlns:w16se="http://schemas.microsoft.com/office/word/2015/wordml/symex" xmlns:wpg="http://schemas.microsoft.com/office/word/2010/wordprocessingGroup" xmlns:wpi="http://schemas.microsoft.com/office/word/2010/wordprocessingInk" xmlns:wne="http://schemas.microsoft.com/office/word/2006/wordml" xmlns:wps="http://schemas.microsoft.com/office/word/2010/wordprocessingShape" mc:Ignorable="w14 w15 w16se w16cid w16 w16cex w16sdtdh w16sdtfl w16du wp14">
+<w:endnotes xmlns:wpc="http://schemas.microsoft.com/office/word/2010/wordprocessingCanvas" xmlns:cx="http://schemas.microsoft.com/office/drawing/2014/chartex" xmlns:cx1="http://schemas.microsoft.com/office/drawing/2015/9/8/chartex" xmlns:cx2="http://schemas.microsoft.com/office/drawing/2015/10/21/chartex" xmlns:cx3="http://schemas.microsoft.com/office/drawing/2016/5/9/chartex" xmlns:cx4="http://schemas.microsoft.com/office/drawing/2016/5/10/chartex" xmlns:cx5="http://schemas.microsoft.com/office/drawing/2016/5/11/chartex" xmlns:cx6="http://schemas.microsoft.com/office/drawing/2016/5/12/chartex" xmlns:cx7="http://schemas.microsoft.com/office/drawing/2016/5/13/chartex" xmlns:cx8="http://schemas.microsoft.com/office/drawing/2016/5/14/chartex" xmlns:mc="http://schemas.openxmlformats.org/markup-compatibility/2006" xmlns:aink="http://schemas.microsoft.com/office/drawing/2016/ink" xmlns:am3d="http://schemas.microsoft.com/office/drawing/2017/model3d" xmlns:o="urn:schemas-microsoft-com:office:office" xmlns:oel="http://schemas.microsoft.com/office/2019/extlst" xmlns:r="http://schemas.openxmlformats.org/officeDocument/2006/relationships" xmlns:m="http://schemas.openxmlformats.org/officeDocument/2006/math" xmlns:v="urn:schemas-microsoft-com:vml" xmlns:wp14="http://schemas.microsoft.com/office/word/2010/wordprocessingDrawing" xmlns:wp="http://schemas.openxmlformats.org/drawingml/2006/wordprocessingDrawing" xmlns:w10="urn:schemas-microsoft-com:office:word" xmlns:w="http://schemas.openxmlformats.org/wordprocessingml/2006/main" xmlns:w14="http://schemas.microsoft.com/office/word/2010/wordml" xmlns:w15="http://schemas.microsoft.com/office/word/2012/wordml" xmlns:w16cei="http://schemas.microsoft.com/office/word/2026/wordml/cei" xmlns:w16cex="http://schemas.microsoft.com/office/word/2018/wordml/cex" xmlns:w16cid="http://schemas.microsoft.com/office/word/2016/wordml/cid" xmlns:w16="http://schemas.microsoft.com/office/word/2018/wordml" xmlns:w16du="http://schemas.microsoft.com/office/word/2023/wordml/word16du" xmlns:w16sdtdh="http://schemas.microsoft.com/office/word/2020/wordml/sdtdatahash" xmlns:w16sdtfl="http://schemas.microsoft.com/office/word/2024/wordml/sdtformatlock" xmlns:w16se="http://schemas.microsoft.com/office/word/2015/wordml/symex" xmlns:wpg="http://schemas.microsoft.com/office/word/2010/wordprocessingGroup" xmlns:wpi="http://schemas.microsoft.com/office/word/2010/wordprocessingInk" xmlns:wne="http://schemas.microsoft.com/office/word/2006/wordml" xmlns:wps="http://schemas.microsoft.com/office/word/2010/wordprocessingShape" mc:Ignorable="w14 w15 w16se w16cid w16 w16cex w16sdtdh w16sdtfl w16du wp14">
   <w:endnote w:type="separator" w:id="-1">
     <w:p>
       <w:r>
@@ -2193,7 +1612,7 @@
 </file>
 
 <file path=word/footer1.xml><?xml version="1.0" encoding="utf-8"?>
-<w:ftr xmlns:wpc="http://schemas.microsoft.com/office/word/2010/wordprocessingCanvas" xmlns:cx="http://schemas.microsoft.com/office/drawing/2014/chartex" xmlns:cx1="http://schemas.microsoft.com/office/drawing/2015/9/8/chartex" xmlns:cx2="http://schemas.microsoft.com/office/drawing/2015/10/21/chartex" xmlns:cx3="http://schemas.microsoft.com/office/drawing/2016/5/9/chartex" xmlns:cx4="http://schemas.microsoft.com/office/drawing/2016/5/10/chartex" xmlns:cx5="http://schemas.microsoft.com/office/drawing/2016/5/11/chartex" xmlns:cx6="http://schemas.microsoft.com/office/drawing/2016/5/12/chartex" xmlns:cx7="http://schemas.microsoft.com/office/drawing/2016/5/13/chartex" xmlns:cx8="http://schemas.microsoft.com/office/drawing/2016/5/14/chartex" xmlns:mc="http://schemas.openxmlformats.org/markup-compatibility/2006" xmlns:aink="http://schemas.microsoft.com/office/drawing/2016/ink" xmlns:am3d="http://schemas.microsoft.com/office/drawing/2017/model3d" xmlns:o="urn:schemas-microsoft-com:office:office" xmlns:oel="http://schemas.microsoft.com/office/2019/extlst" xmlns:r="http://schemas.openxmlformats.org/officeDocument/2006/relationships" xmlns:m="http://schemas.openxmlformats.org/officeDocument/2006/math" xmlns:v="urn:schemas-microsoft-com:vml" xmlns:wp14="http://schemas.microsoft.com/office/word/2010/wordprocessingDrawing" xmlns:wp="http://schemas.openxmlformats.org/drawingml/2006/wordprocessingDrawing" xmlns:w10="urn:schemas-microsoft-com:office:word" xmlns:w="http://schemas.openxmlformats.org/wordprocessingml/2006/main" xmlns:w14="http://schemas.microsoft.com/office/word/2010/wordml" xmlns:w15="http://schemas.microsoft.com/office/word/2012/wordml" xmlns:w16cex="http://schemas.microsoft.com/office/word/2018/wordml/cex" xmlns:w16cid="http://schemas.microsoft.com/office/word/2016/wordml/cid" xmlns:w16="http://schemas.microsoft.com/office/word/2018/wordml" xmlns:w16du="http://schemas.microsoft.com/office/word/2023/wordml/word16du" xmlns:w16sdtdh="http://schemas.microsoft.com/office/word/2020/wordml/sdtdatahash" xmlns:w16sdtfl="http://schemas.microsoft.com/office/word/2024/wordml/sdtformatlock" xmlns:w16se="http://schemas.microsoft.com/office/word/2015/wordml/symex" xmlns:wpg="http://schemas.microsoft.com/office/word/2010/wordprocessingGroup" xmlns:wpi="http://schemas.microsoft.com/office/word/2010/wordprocessingInk" xmlns:wne="http://schemas.microsoft.com/office/word/2006/wordml" xmlns:wps="http://schemas.microsoft.com/office/word/2010/wordprocessingShape" mc:Ignorable="w14 w15 w16se w16cid w16 w16cex w16sdtdh w16sdtfl w16du wp14">
+<w:ftr xmlns:wpc="http://schemas.microsoft.com/office/word/2010/wordprocessingCanvas" xmlns:cx="http://schemas.microsoft.com/office/drawing/2014/chartex" xmlns:cx1="http://schemas.microsoft.com/office/drawing/2015/9/8/chartex" xmlns:cx2="http://schemas.microsoft.com/office/drawing/2015/10/21/chartex" xmlns:cx3="http://schemas.microsoft.com/office/drawing/2016/5/9/chartex" xmlns:cx4="http://schemas.microsoft.com/office/drawing/2016/5/10/chartex" xmlns:cx5="http://schemas.microsoft.com/office/drawing/2016/5/11/chartex" xmlns:cx6="http://schemas.microsoft.com/office/drawing/2016/5/12/chartex" xmlns:cx7="http://schemas.microsoft.com/office/drawing/2016/5/13/chartex" xmlns:cx8="http://schemas.microsoft.com/office/drawing/2016/5/14/chartex" xmlns:mc="http://schemas.openxmlformats.org/markup-compatibility/2006" xmlns:aink="http://schemas.microsoft.com/office/drawing/2016/ink" xmlns:am3d="http://schemas.microsoft.com/office/drawing/2017/model3d" xmlns:o="urn:schemas-microsoft-com:office:office" xmlns:oel="http://schemas.microsoft.com/office/2019/extlst" xmlns:r="http://schemas.openxmlformats.org/officeDocument/2006/relationships" xmlns:m="http://schemas.openxmlformats.org/officeDocument/2006/math" xmlns:v="urn:schemas-microsoft-com:vml" xmlns:wp14="http://schemas.microsoft.com/office/word/2010/wordprocessingDrawing" xmlns:wp="http://schemas.openxmlformats.org/drawingml/2006/wordprocessingDrawing" xmlns:w10="urn:schemas-microsoft-com:office:word" xmlns:w="http://schemas.openxmlformats.org/wordprocessingml/2006/main" xmlns:w14="http://schemas.microsoft.com/office/word/2010/wordml" xmlns:w15="http://schemas.microsoft.com/office/word/2012/wordml" xmlns:w16cei="http://schemas.microsoft.com/office/word/2026/wordml/cei" xmlns:w16cex="http://schemas.microsoft.com/office/word/2018/wordml/cex" xmlns:w16cid="http://schemas.microsoft.com/office/word/2016/wordml/cid" xmlns:w16="http://schemas.microsoft.com/office/word/2018/wordml" xmlns:w16du="http://schemas.microsoft.com/office/word/2023/wordml/word16du" xmlns:w16sdtdh="http://schemas.microsoft.com/office/word/2020/wordml/sdtdatahash" xmlns:w16sdtfl="http://schemas.microsoft.com/office/word/2024/wordml/sdtformatlock" xmlns:w16se="http://schemas.microsoft.com/office/word/2015/wordml/symex" xmlns:wpg="http://schemas.microsoft.com/office/word/2010/wordprocessingGroup" xmlns:wpi="http://schemas.microsoft.com/office/word/2010/wordprocessingInk" xmlns:wne="http://schemas.microsoft.com/office/word/2006/wordml" xmlns:wps="http://schemas.microsoft.com/office/word/2010/wordprocessingShape" mc:Ignorable="w14 w15 w16se w16cid w16 w16cex w16sdtdh w16sdtfl w16du wp14">
   <w:p>
     <w:pPr>
       <w:pStyle w:val="Footer"/>
@@ -2238,7 +1657,7 @@
 </file>
 
 <file path=word/footer2.xml><?xml version="1.0" encoding="utf-8"?>
-<w:ftr xmlns:wpc="http://schemas.microsoft.com/office/word/2010/wordprocessingCanvas" xmlns:cx="http://schemas.microsoft.com/office/drawing/2014/chartex" xmlns:cx1="http://schemas.microsoft.com/office/drawing/2015/9/8/chartex" xmlns:cx2="http://schemas.microsoft.com/office/drawing/2015/10/21/chartex" xmlns:cx3="http://schemas.microsoft.com/office/drawing/2016/5/9/chartex" xmlns:cx4="http://schemas.microsoft.com/office/drawing/2016/5/10/chartex" xmlns:cx5="http://schemas.microsoft.com/office/drawing/2016/5/11/chartex" xmlns:cx6="http://schemas.microsoft.com/office/drawing/2016/5/12/chartex" xmlns:cx7="http://schemas.microsoft.com/office/drawing/2016/5/13/chartex" xmlns:cx8="http://schemas.microsoft.com/office/drawing/2016/5/14/chartex" xmlns:mc="http://schemas.openxmlformats.org/markup-compatibility/2006" xmlns:aink="http://schemas.microsoft.com/office/drawing/2016/ink" xmlns:am3d="http://schemas.microsoft.com/office/drawing/2017/model3d" xmlns:o="urn:schemas-microsoft-com:office:office" xmlns:oel="http://schemas.microsoft.com/office/2019/extlst" xmlns:r="http://schemas.openxmlformats.org/officeDocument/2006/relationships" xmlns:m="http://schemas.openxmlformats.org/officeDocument/2006/math" xmlns:v="urn:schemas-microsoft-com:vml" xmlns:wp14="http://schemas.microsoft.com/office/word/2010/wordprocessingDrawing" xmlns:wp="http://schemas.openxmlformats.org/drawingml/2006/wordprocessingDrawing" xmlns:w10="urn:schemas-microsoft-com:office:word" xmlns:w="http://schemas.openxmlformats.org/wordprocessingml/2006/main" xmlns:w14="http://schemas.microsoft.com/office/word/2010/wordml" xmlns:w15="http://schemas.microsoft.com/office/word/2012/wordml" xmlns:w16cex="http://schemas.microsoft.com/office/word/2018/wordml/cex" xmlns:w16cid="http://schemas.microsoft.com/office/word/2016/wordml/cid" xmlns:w16="http://schemas.microsoft.com/office/word/2018/wordml" xmlns:w16du="http://schemas.microsoft.com/office/word/2023/wordml/word16du" xmlns:w16sdtdh="http://schemas.microsoft.com/office/word/2020/wordml/sdtdatahash" xmlns:w16sdtfl="http://schemas.microsoft.com/office/word/2024/wordml/sdtformatlock" xmlns:w16se="http://schemas.microsoft.com/office/word/2015/wordml/symex" xmlns:wpg="http://schemas.microsoft.com/office/word/2010/wordprocessingGroup" xmlns:wpi="http://schemas.microsoft.com/office/word/2010/wordprocessingInk" xmlns:wne="http://schemas.microsoft.com/office/word/2006/wordml" xmlns:wps="http://schemas.microsoft.com/office/word/2010/wordprocessingShape" mc:Ignorable="w14 w15 w16se w16cid w16 w16cex w16sdtdh w16sdtfl w16du wp14">
+<w:ftr xmlns:wpc="http://schemas.microsoft.com/office/word/2010/wordprocessingCanvas" xmlns:cx="http://schemas.microsoft.com/office/drawing/2014/chartex" xmlns:cx1="http://schemas.microsoft.com/office/drawing/2015/9/8/chartex" xmlns:cx2="http://schemas.microsoft.com/office/drawing/2015/10/21/chartex" xmlns:cx3="http://schemas.microsoft.com/office/drawing/2016/5/9/chartex" xmlns:cx4="http://schemas.microsoft.com/office/drawing/2016/5/10/chartex" xmlns:cx5="http://schemas.microsoft.com/office/drawing/2016/5/11/chartex" xmlns:cx6="http://schemas.microsoft.com/office/drawing/2016/5/12/chartex" xmlns:cx7="http://schemas.microsoft.com/office/drawing/2016/5/13/chartex" xmlns:cx8="http://schemas.microsoft.com/office/drawing/2016/5/14/chartex" xmlns:mc="http://schemas.openxmlformats.org/markup-compatibility/2006" xmlns:aink="http://schemas.microsoft.com/office/drawing/2016/ink" xmlns:am3d="http://schemas.microsoft.com/office/drawing/2017/model3d" xmlns:o="urn:schemas-microsoft-com:office:office" xmlns:oel="http://schemas.microsoft.com/office/2019/extlst" xmlns:r="http://schemas.openxmlformats.org/officeDocument/2006/relationships" xmlns:m="http://schemas.openxmlformats.org/officeDocument/2006/math" xmlns:v="urn:schemas-microsoft-com:vml" xmlns:wp14="http://schemas.microsoft.com/office/word/2010/wordprocessingDrawing" xmlns:wp="http://schemas.openxmlformats.org/drawingml/2006/wordprocessingDrawing" xmlns:w10="urn:schemas-microsoft-com:office:word" xmlns:w="http://schemas.openxmlformats.org/wordprocessingml/2006/main" xmlns:w14="http://schemas.microsoft.com/office/word/2010/wordml" xmlns:w15="http://schemas.microsoft.com/office/word/2012/wordml" xmlns:w16cei="http://schemas.microsoft.com/office/word/2026/wordml/cei" xmlns:w16cex="http://schemas.microsoft.com/office/word/2018/wordml/cex" xmlns:w16cid="http://schemas.microsoft.com/office/word/2016/wordml/cid" xmlns:w16="http://schemas.microsoft.com/office/word/2018/wordml" xmlns:w16du="http://schemas.microsoft.com/office/word/2023/wordml/word16du" xmlns:w16sdtdh="http://schemas.microsoft.com/office/word/2020/wordml/sdtdatahash" xmlns:w16sdtfl="http://schemas.microsoft.com/office/word/2024/wordml/sdtformatlock" xmlns:w16se="http://schemas.microsoft.com/office/word/2015/wordml/symex" xmlns:wpg="http://schemas.microsoft.com/office/word/2010/wordprocessingGroup" xmlns:wpi="http://schemas.microsoft.com/office/word/2010/wordprocessingInk" xmlns:wne="http://schemas.microsoft.com/office/word/2006/wordml" xmlns:wps="http://schemas.microsoft.com/office/word/2010/wordprocessingShape" mc:Ignorable="w14 w15 w16se w16cid w16 w16cex w16sdtdh w16sdtfl w16du wp14">
   <w:p>
     <w:pPr>
       <w:pStyle w:val="Footer"/>
@@ -2249,7 +1668,7 @@
 </file>
 
 <file path=word/footnotes.xml><?xml version="1.0" encoding="utf-8"?>
-<w:footnotes xmlns:wpc="http://schemas.microsoft.com/office/word/2010/wordprocessingCanvas" xmlns:cx="http://schemas.microsoft.com/office/drawing/2014/chartex" xmlns:cx1="http://schemas.microsoft.com/office/drawing/2015/9/8/chartex" xmlns:cx2="http://schemas.microsoft.com/office/drawing/2015/10/21/chartex" xmlns:cx3="http://schemas.microsoft.com/office/drawing/2016/5/9/chartex" xmlns:cx4="http://schemas.microsoft.com/office/drawing/2016/5/10/chartex" xmlns:cx5="http://schemas.microsoft.com/office/drawing/2016/5/11/chartex" xmlns:cx6="http://schemas.microsoft.com/office/drawing/2016/5/12/chartex" xmlns:cx7="http://schemas.microsoft.com/office/drawing/2016/5/13/chartex" xmlns:cx8="http://schemas.microsoft.com/office/drawing/2016/5/14/chartex" xmlns:mc="http://schemas.openxmlformats.org/markup-compatibility/2006" xmlns:aink="http://schemas.microsoft.com/office/drawing/2016/ink" xmlns:am3d="http://schemas.microsoft.com/office/drawing/2017/model3d" xmlns:o="urn:schemas-microsoft-com:office:office" xmlns:oel="http://schemas.microsoft.com/office/2019/extlst" xmlns:r="http://schemas.openxmlformats.org/officeDocument/2006/relationships" xmlns:m="http://schemas.openxmlformats.org/officeDocument/2006/math" xmlns:v="urn:schemas-microsoft-com:vml" xmlns:wp14="http://schemas.microsoft.com/office/word/2010/wordprocessingDrawing" xmlns:wp="http://schemas.openxmlformats.org/drawingml/2006/wordprocessingDrawing" xmlns:w10="urn:schemas-microsoft-com:office:word" xmlns:w="http://schemas.openxmlformats.org/wordprocessingml/2006/main" xmlns:w14="http://schemas.microsoft.com/office/word/2010/wordml" xmlns:w15="http://schemas.microsoft.com/office/word/2012/wordml" xmlns:w16cex="http://schemas.microsoft.com/office/word/2018/wordml/cex" xmlns:w16cid="http://schemas.microsoft.com/office/word/2016/wordml/cid" xmlns:w16="http://schemas.microsoft.com/office/word/2018/wordml" xmlns:w16du="http://schemas.microsoft.com/office/word/2023/wordml/word16du" xmlns:w16sdtdh="http://schemas.microsoft.com/office/word/2020/wordml/sdtdatahash" xmlns:w16sdtfl="http://schemas.microsoft.com/office/word/2024/wordml/sdtformatlock" xmlns:w16se="http://schemas.microsoft.com/office/word/2015/wordml/symex" xmlns:wpg="http://schemas.microsoft.com/office/word/2010/wordprocessingGroup" xmlns:wpi="http://schemas.microsoft.com/office/word/2010/wordprocessingInk" xmlns:wne="http://schemas.microsoft.com/office/word/2006/wordml" xmlns:wps="http://schemas.microsoft.com/office/word/2010/wordprocessingShape" mc:Ignorable="w14 w15 w16se w16cid w16 w16cex w16sdtdh w16sdtfl w16du wp14">
+<w:footnotes xmlns:wpc="http://schemas.microsoft.com/office/word/2010/wordprocessingCanvas" xmlns:cx="http://schemas.microsoft.com/office/drawing/2014/chartex" xmlns:cx1="http://schemas.microsoft.com/office/drawing/2015/9/8/chartex" xmlns:cx2="http://schemas.microsoft.com/office/drawing/2015/10/21/chartex" xmlns:cx3="http://schemas.microsoft.com/office/drawing/2016/5/9/chartex" xmlns:cx4="http://schemas.microsoft.com/office/drawing/2016/5/10/chartex" xmlns:cx5="http://schemas.microsoft.com/office/drawing/2016/5/11/chartex" xmlns:cx6="http://schemas.microsoft.com/office/drawing/2016/5/12/chartex" xmlns:cx7="http://schemas.microsoft.com/office/drawing/2016/5/13/chartex" xmlns:cx8="http://schemas.microsoft.com/office/drawing/2016/5/14/chartex" xmlns:mc="http://schemas.openxmlformats.org/markup-compatibility/2006" xmlns:aink="http://schemas.microsoft.com/office/drawing/2016/ink" xmlns:am3d="http://schemas.microsoft.com/office/drawing/2017/model3d" xmlns:o="urn:schemas-microsoft-com:office:office" xmlns:oel="http://schemas.microsoft.com/office/2019/extlst" xmlns:r="http://schemas.openxmlformats.org/officeDocument/2006/relationships" xmlns:m="http://schemas.openxmlformats.org/officeDocument/2006/math" xmlns:v="urn:schemas-microsoft-com:vml" xmlns:wp14="http://schemas.microsoft.com/office/word/2010/wordprocessingDrawing" xmlns:wp="http://schemas.openxmlformats.org/drawingml/2006/wordprocessingDrawing" xmlns:w10="urn:schemas-microsoft-com:office:word" xmlns:w="http://schemas.openxmlformats.org/wordprocessingml/2006/main" xmlns:w14="http://schemas.microsoft.com/office/word/2010/wordml" xmlns:w15="http://schemas.microsoft.com/office/word/2012/wordml" xmlns:w16cei="http://schemas.microsoft.com/office/word/2026/wordml/cei" xmlns:w16cex="http://schemas.microsoft.com/office/word/2018/wordml/cex" xmlns:w16cid="http://schemas.microsoft.com/office/word/2016/wordml/cid" xmlns:w16="http://schemas.microsoft.com/office/word/2018/wordml" xmlns:w16du="http://schemas.microsoft.com/office/word/2023/wordml/word16du" xmlns:w16sdtdh="http://schemas.microsoft.com/office/word/2020/wordml/sdtdatahash" xmlns:w16sdtfl="http://schemas.microsoft.com/office/word/2024/wordml/sdtformatlock" xmlns:w16se="http://schemas.microsoft.com/office/word/2015/wordml/symex" xmlns:wpg="http://schemas.microsoft.com/office/word/2010/wordprocessingGroup" xmlns:wpi="http://schemas.microsoft.com/office/word/2010/wordprocessingInk" xmlns:wne="http://schemas.microsoft.com/office/word/2006/wordml" xmlns:wps="http://schemas.microsoft.com/office/word/2010/wordprocessingShape" mc:Ignorable="w14 w15 w16se w16cid w16 w16cex w16sdtdh w16sdtfl w16du wp14">
   <w:footnote w:type="separator" w:id="-1">
     <w:p>
       <w:r>
@@ -2268,7 +1687,7 @@
 </file>
 
 <file path=word/header1.xml><?xml version="1.0" encoding="utf-8"?>
-<w:hdr xmlns:wpc="http://schemas.microsoft.com/office/word/2010/wordprocessingCanvas" xmlns:cx="http://schemas.microsoft.com/office/drawing/2014/chartex" xmlns:cx1="http://schemas.microsoft.com/office/drawing/2015/9/8/chartex" xmlns:cx2="http://schemas.microsoft.com/office/drawing/2015/10/21/chartex" xmlns:cx3="http://schemas.microsoft.com/office/drawing/2016/5/9/chartex" xmlns:cx4="http://schemas.microsoft.com/office/drawing/2016/5/10/chartex" xmlns:cx5="http://schemas.microsoft.com/office/drawing/2016/5/11/chartex" xmlns:cx6="http://schemas.microsoft.com/office/drawing/2016/5/12/chartex" xmlns:cx7="http://schemas.microsoft.com/office/drawing/2016/5/13/chartex" xmlns:cx8="http://schemas.microsoft.com/office/drawing/2016/5/14/chartex" xmlns:mc="http://schemas.openxmlformats.org/markup-compatibility/2006" xmlns:aink="http://schemas.microsoft.com/office/drawing/2016/ink" xmlns:am3d="http://schemas.microsoft.com/office/drawing/2017/model3d" xmlns:o="urn:schemas-microsoft-com:office:office" xmlns:oel="http://schemas.microsoft.com/office/2019/extlst" xmlns:r="http://schemas.openxmlformats.org/officeDocument/2006/relationships" xmlns:m="http://schemas.openxmlformats.org/officeDocument/2006/math" xmlns:v="urn:schemas-microsoft-com:vml" xmlns:wp14="http://schemas.microsoft.com/office/word/2010/wordprocessingDrawing" xmlns:wp="http://schemas.openxmlformats.org/drawingml/2006/wordprocessingDrawing" xmlns:w10="urn:schemas-microsoft-com:office:word" xmlns:w="http://schemas.openxmlformats.org/wordprocessingml/2006/main" xmlns:w14="http://schemas.microsoft.com/office/word/2010/wordml" xmlns:w15="http://schemas.microsoft.com/office/word/2012/wordml" xmlns:w16cex="http://schemas.microsoft.com/office/word/2018/wordml/cex" xmlns:w16cid="http://schemas.microsoft.com/office/word/2016/wordml/cid" xmlns:w16="http://schemas.microsoft.com/office/word/2018/wordml" xmlns:w16du="http://schemas.microsoft.com/office/word/2023/wordml/word16du" xmlns:w16sdtdh="http://schemas.microsoft.com/office/word/2020/wordml/sdtdatahash" xmlns:w16sdtfl="http://schemas.microsoft.com/office/word/2024/wordml/sdtformatlock" xmlns:w16se="http://schemas.microsoft.com/office/word/2015/wordml/symex" xmlns:wpg="http://schemas.microsoft.com/office/word/2010/wordprocessingGroup" xmlns:wpi="http://schemas.microsoft.com/office/word/2010/wordprocessingInk" xmlns:wne="http://schemas.microsoft.com/office/word/2006/wordml" xmlns:wps="http://schemas.microsoft.com/office/word/2010/wordprocessingShape" mc:Ignorable="w14 w15 w16se w16cid w16 w16cex w16sdtdh w16sdtfl w16du wp14">
+<w:hdr xmlns:wpc="http://schemas.microsoft.com/office/word/2010/wordprocessingCanvas" xmlns:cx="http://schemas.microsoft.com/office/drawing/2014/chartex" xmlns:cx1="http://schemas.microsoft.com/office/drawing/2015/9/8/chartex" xmlns:cx2="http://schemas.microsoft.com/office/drawing/2015/10/21/chartex" xmlns:cx3="http://schemas.microsoft.com/office/drawing/2016/5/9/chartex" xmlns:cx4="http://schemas.microsoft.com/office/drawing/2016/5/10/chartex" xmlns:cx5="http://schemas.microsoft.com/office/drawing/2016/5/11/chartex" xmlns:cx6="http://schemas.microsoft.com/office/drawing/2016/5/12/chartex" xmlns:cx7="http://schemas.microsoft.com/office/drawing/2016/5/13/chartex" xmlns:cx8="http://schemas.microsoft.com/office/drawing/2016/5/14/chartex" xmlns:mc="http://schemas.openxmlformats.org/markup-compatibility/2006" xmlns:aink="http://schemas.microsoft.com/office/drawing/2016/ink" xmlns:am3d="http://schemas.microsoft.com/office/drawing/2017/model3d" xmlns:o="urn:schemas-microsoft-com:office:office" xmlns:oel="http://schemas.microsoft.com/office/2019/extlst" xmlns:r="http://schemas.openxmlformats.org/officeDocument/2006/relationships" xmlns:m="http://schemas.openxmlformats.org/officeDocument/2006/math" xmlns:v="urn:schemas-microsoft-com:vml" xmlns:wp14="http://schemas.microsoft.com/office/word/2010/wordprocessingDrawing" xmlns:wp="http://schemas.openxmlformats.org/drawingml/2006/wordprocessingDrawing" xmlns:w10="urn:schemas-microsoft-com:office:word" xmlns:w="http://schemas.openxmlformats.org/wordprocessingml/2006/main" xmlns:w14="http://schemas.microsoft.com/office/word/2010/wordml" xmlns:w15="http://schemas.microsoft.com/office/word/2012/wordml" xmlns:w16cei="http://schemas.microsoft.com/office/word/2026/wordml/cei" xmlns:w16cex="http://schemas.microsoft.com/office/word/2018/wordml/cex" xmlns:w16cid="http://schemas.microsoft.com/office/word/2016/wordml/cid" xmlns:w16="http://schemas.microsoft.com/office/word/2018/wordml" xmlns:w16du="http://schemas.microsoft.com/office/word/2023/wordml/word16du" xmlns:w16sdtdh="http://schemas.microsoft.com/office/word/2020/wordml/sdtdatahash" xmlns:w16sdtfl="http://schemas.microsoft.com/office/word/2024/wordml/sdtformatlock" xmlns:w16se="http://schemas.microsoft.com/office/word/2015/wordml/symex" xmlns:wpg="http://schemas.microsoft.com/office/word/2010/wordprocessingGroup" xmlns:wpi="http://schemas.microsoft.com/office/word/2010/wordprocessingInk" xmlns:wne="http://schemas.microsoft.com/office/word/2006/wordml" xmlns:wps="http://schemas.microsoft.com/office/word/2010/wordprocessingShape" mc:Ignorable="w14 w15 w16se w16cid w16 w16cex w16sdtdh w16sdtfl w16du wp14">
   <w:p>
     <w:pPr>
       <w:pStyle w:val="Header"/>
@@ -2300,7 +1719,7 @@
 </file>
 
 <file path=word/numbering.xml><?xml version="1.0" encoding="utf-8"?>
-<w:numbering xmlns:wpc="http://schemas.microsoft.com/office/word/2010/wordprocessingCanvas" xmlns:cx="http://schemas.microsoft.com/office/drawing/2014/chartex" xmlns:cx1="http://schemas.microsoft.com/office/drawing/2015/9/8/chartex" xmlns:cx2="http://schemas.microsoft.com/office/drawing/2015/10/21/chartex" xmlns:cx3="http://schemas.microsoft.com/office/drawing/2016/5/9/chartex" xmlns:cx4="http://schemas.microsoft.com/office/drawing/2016/5/10/chartex" xmlns:cx5="http://schemas.microsoft.com/office/drawing/2016/5/11/chartex" xmlns:cx6="http://schemas.microsoft.com/office/drawing/2016/5/12/chartex" xmlns:cx7="http://schemas.microsoft.com/office/drawing/2016/5/13/chartex" xmlns:cx8="http://schemas.microsoft.com/office/drawing/2016/5/14/chartex" xmlns:mc="http://schemas.openxmlformats.org/markup-compatibility/2006" xmlns:aink="http://schemas.microsoft.com/office/drawing/2016/ink" xmlns:am3d="http://schemas.microsoft.com/office/drawing/2017/model3d" xmlns:o="urn:schemas-microsoft-com:office:office" xmlns:oel="http://schemas.microsoft.com/office/2019/extlst" xmlns:r="http://schemas.openxmlformats.org/officeDocument/2006/relationships" xmlns:m="http://schemas.openxmlformats.org/officeDocument/2006/math" xmlns:v="urn:schemas-microsoft-com:vml" xmlns:wp14="http://schemas.microsoft.com/office/word/2010/wordprocessingDrawing" xmlns:wp="http://schemas.openxmlformats.org/drawingml/2006/wordprocessingDrawing" xmlns:w10="urn:schemas-microsoft-com:office:word" xmlns:w="http://schemas.openxmlformats.org/wordprocessingml/2006/main" xmlns:w14="http://schemas.microsoft.com/office/word/2010/wordml" xmlns:w15="http://schemas.microsoft.com/office/word/2012/wordml" xmlns:w16cex="http://schemas.microsoft.com/office/word/2018/wordml/cex" xmlns:w16cid="http://schemas.microsoft.com/office/word/2016/wordml/cid" xmlns:w16="http://schemas.microsoft.com/office/word/2018/wordml" xmlns:w16du="http://schemas.microsoft.com/office/word/2023/wordml/word16du" xmlns:w16sdtdh="http://schemas.microsoft.com/office/word/2020/wordml/sdtdatahash" xmlns:w16sdtfl="http://schemas.microsoft.com/office/word/2024/wordml/sdtformatlock" xmlns:w16se="http://schemas.microsoft.com/office/word/2015/wordml/symex" xmlns:wpg="http://schemas.microsoft.com/office/word/2010/wordprocessingGroup" xmlns:wpi="http://schemas.microsoft.com/office/word/2010/wordprocessingInk" xmlns:wne="http://schemas.microsoft.com/office/word/2006/wordml" xmlns:wps="http://schemas.microsoft.com/office/word/2010/wordprocessingShape" mc:Ignorable="w14 w15 w16se w16cid w16 w16cex w16sdtdh w16sdtfl w16du wp14">
+<w:numbering xmlns:wpc="http://schemas.microsoft.com/office/word/2010/wordprocessingCanvas" xmlns:cx="http://schemas.microsoft.com/office/drawing/2014/chartex" xmlns:cx1="http://schemas.microsoft.com/office/drawing/2015/9/8/chartex" xmlns:cx2="http://schemas.microsoft.com/office/drawing/2015/10/21/chartex" xmlns:cx3="http://schemas.microsoft.com/office/drawing/2016/5/9/chartex" xmlns:cx4="http://schemas.microsoft.com/office/drawing/2016/5/10/chartex" xmlns:cx5="http://schemas.microsoft.com/office/drawing/2016/5/11/chartex" xmlns:cx6="http://schemas.microsoft.com/office/drawing/2016/5/12/chartex" xmlns:cx7="http://schemas.microsoft.com/office/drawing/2016/5/13/chartex" xmlns:cx8="http://schemas.microsoft.com/office/drawing/2016/5/14/chartex" xmlns:mc="http://schemas.openxmlformats.org/markup-compatibility/2006" xmlns:aink="http://schemas.microsoft.com/office/drawing/2016/ink" xmlns:am3d="http://schemas.microsoft.com/office/drawing/2017/model3d" xmlns:o="urn:schemas-microsoft-com:office:office" xmlns:oel="http://schemas.microsoft.com/office/2019/extlst" xmlns:r="http://schemas.openxmlformats.org/officeDocument/2006/relationships" xmlns:m="http://schemas.openxmlformats.org/officeDocument/2006/math" xmlns:v="urn:schemas-microsoft-com:vml" xmlns:wp14="http://schemas.microsoft.com/office/word/2010/wordprocessingDrawing" xmlns:wp="http://schemas.openxmlformats.org/drawingml/2006/wordprocessingDrawing" xmlns:w10="urn:schemas-microsoft-com:office:word" xmlns:w="http://schemas.openxmlformats.org/wordprocessingml/2006/main" xmlns:w14="http://schemas.microsoft.com/office/word/2010/wordml" xmlns:w15="http://schemas.microsoft.com/office/word/2012/wordml" xmlns:w16cei="http://schemas.microsoft.com/office/word/2026/wordml/cei" xmlns:w16cex="http://schemas.microsoft.com/office/word/2018/wordml/cex" xmlns:w16cid="http://schemas.microsoft.com/office/word/2016/wordml/cid" xmlns:w16="http://schemas.microsoft.com/office/word/2018/wordml" xmlns:w16du="http://schemas.microsoft.com/office/word/2023/wordml/word16du" xmlns:w16sdtdh="http://schemas.microsoft.com/office/word/2020/wordml/sdtdatahash" xmlns:w16sdtfl="http://schemas.microsoft.com/office/word/2024/wordml/sdtformatlock" xmlns:w16se="http://schemas.microsoft.com/office/word/2015/wordml/symex" xmlns:wpg="http://schemas.microsoft.com/office/word/2010/wordprocessingGroup" xmlns:wpi="http://schemas.microsoft.com/office/word/2010/wordprocessingInk" xmlns:wne="http://schemas.microsoft.com/office/word/2006/wordml" xmlns:wps="http://schemas.microsoft.com/office/word/2010/wordprocessingShape" mc:Ignorable="w14 w15 w16se w16cid w16 w16cex w16sdtdh w16sdtfl w16du wp14">
   <w:abstractNum w:abstractNumId="0" w15:restartNumberingAfterBreak="0">
     <w:nsid w:val="27F0573B"/>
     <w:multiLevelType w:val="singleLevel"/>

</xml_diff>